<commit_message>
Connect organelle shape, size, and function to scale in 7th grade lab
Adds an organelle data card, cell connection table, eight organelle scale
tasks, and matching prep assignment and lab report updates.

Co-Authored-By: Claude Sonnet 5 <noreply@anthropic.com>
</commit_message>
<xml_diff>
--- a/lab-documents/7th_Lab_Prep_Assignment.docx
+++ b/lab-documents/7th_Lab_Prep_Assignment.docx
@@ -1358,6 +1358,204 @@
                 <w:szCs w:val="19"/>
               </w:rPr>
               <w:t xml:space="preserve">Structure and function</w:t>
+            </w:r>
+          </w:p>
+        </w:tc>
+        <w:tc>
+          <w:tcPr>
+            <w:tcW w:type="dxa" w:w="4300"/>
+            <w:tcBorders>
+              <w:top w:val="single" w:color="9A9A9A" w:sz="4"/>
+              <w:left w:val="single" w:color="9A9A9A" w:sz="4"/>
+              <w:bottom w:val="single" w:color="9A9A9A" w:sz="4"/>
+              <w:right w:val="single" w:color="9A9A9A" w:sz="4"/>
+            </w:tcBorders>
+            <w:tcMar>
+              <w:top w:type="dxa" w:w="70"/>
+              <w:left w:type="dxa" w:w="100"/>
+              <w:bottom w:type="dxa" w:w="70"/>
+              <w:right w:type="dxa" w:w="100"/>
+            </w:tcMar>
+            <w:vAlign w:val="top"/>
+          </w:tcPr>
+          <w:p>
+            <w:pPr>
+              <w:spacing w:after="0"/>
+            </w:pPr>
+            <w:r>
+              <w:rPr>
+                <w:rFonts w:ascii="Arial" w:cs="Arial" w:eastAsia="Arial" w:hAnsi="Arial"/>
+              </w:rPr>
+              <w:t xml:space="preserve"> </w:t>
+            </w:r>
+          </w:p>
+        </w:tc>
+        <w:tc>
+          <w:tcPr>
+            <w:tcW w:type="dxa" w:w="3480"/>
+            <w:tcBorders>
+              <w:top w:val="single" w:color="9A9A9A" w:sz="4"/>
+              <w:left w:val="single" w:color="9A9A9A" w:sz="4"/>
+              <w:bottom w:val="single" w:color="9A9A9A" w:sz="4"/>
+              <w:right w:val="single" w:color="9A9A9A" w:sz="4"/>
+            </w:tcBorders>
+            <w:tcMar>
+              <w:top w:type="dxa" w:w="70"/>
+              <w:left w:type="dxa" w:w="100"/>
+              <w:bottom w:type="dxa" w:w="70"/>
+              <w:right w:type="dxa" w:w="100"/>
+            </w:tcMar>
+            <w:vAlign w:val="top"/>
+          </w:tcPr>
+          <w:p>
+            <w:pPr>
+              <w:spacing w:after="0"/>
+            </w:pPr>
+            <w:r>
+              <w:rPr>
+                <w:rFonts w:ascii="Arial" w:cs="Arial" w:eastAsia="Arial" w:hAnsi="Arial"/>
+              </w:rPr>
+              <w:t xml:space="preserve"> </w:t>
+            </w:r>
+          </w:p>
+        </w:tc>
+      </w:tr>
+      <w:tr>
+        <w:trPr>
+          <w:cantSplit/>
+          <w:tblHeader w:val="false"/>
+          <w:trHeight w:val="900" w:hRule="atLeast"/>
+        </w:trPr>
+        <w:tc>
+          <w:tcPr>
+            <w:tcW w:type="dxa" w:w="2300"/>
+            <w:tcBorders>
+              <w:top w:val="single" w:color="9A9A9A" w:sz="4"/>
+              <w:left w:val="single" w:color="9A9A9A" w:sz="4"/>
+              <w:bottom w:val="single" w:color="9A9A9A" w:sz="4"/>
+              <w:right w:val="single" w:color="9A9A9A" w:sz="4"/>
+            </w:tcBorders>
+            <w:shd w:fill="F3EFE3" w:color="auto" w:val="clear"/>
+            <w:tcMar>
+              <w:top w:type="dxa" w:w="70"/>
+              <w:left w:type="dxa" w:w="100"/>
+              <w:bottom w:type="dxa" w:w="70"/>
+              <w:right w:type="dxa" w:w="100"/>
+            </w:tcMar>
+            <w:vAlign w:val="top"/>
+          </w:tcPr>
+          <w:p>
+            <w:pPr>
+              <w:spacing w:after="40"/>
+            </w:pPr>
+            <w:r>
+              <w:rPr>
+                <w:rFonts w:ascii="Arial" w:cs="Arial" w:eastAsia="Arial" w:hAnsi="Arial"/>
+                <w:b/>
+                <w:bCs/>
+                <w:sz w:val="19"/>
+                <w:szCs w:val="19"/>
+              </w:rPr>
+              <w:t xml:space="preserve">Organelle</w:t>
+            </w:r>
+          </w:p>
+        </w:tc>
+        <w:tc>
+          <w:tcPr>
+            <w:tcW w:type="dxa" w:w="4300"/>
+            <w:tcBorders>
+              <w:top w:val="single" w:color="9A9A9A" w:sz="4"/>
+              <w:left w:val="single" w:color="9A9A9A" w:sz="4"/>
+              <w:bottom w:val="single" w:color="9A9A9A" w:sz="4"/>
+              <w:right w:val="single" w:color="9A9A9A" w:sz="4"/>
+            </w:tcBorders>
+            <w:tcMar>
+              <w:top w:type="dxa" w:w="70"/>
+              <w:left w:type="dxa" w:w="100"/>
+              <w:bottom w:type="dxa" w:w="70"/>
+              <w:right w:type="dxa" w:w="100"/>
+            </w:tcMar>
+            <w:vAlign w:val="top"/>
+          </w:tcPr>
+          <w:p>
+            <w:pPr>
+              <w:spacing w:after="0"/>
+            </w:pPr>
+            <w:r>
+              <w:rPr>
+                <w:rFonts w:ascii="Arial" w:cs="Arial" w:eastAsia="Arial" w:hAnsi="Arial"/>
+              </w:rPr>
+              <w:t xml:space="preserve"> </w:t>
+            </w:r>
+          </w:p>
+        </w:tc>
+        <w:tc>
+          <w:tcPr>
+            <w:tcW w:type="dxa" w:w="3480"/>
+            <w:tcBorders>
+              <w:top w:val="single" w:color="9A9A9A" w:sz="4"/>
+              <w:left w:val="single" w:color="9A9A9A" w:sz="4"/>
+              <w:bottom w:val="single" w:color="9A9A9A" w:sz="4"/>
+              <w:right w:val="single" w:color="9A9A9A" w:sz="4"/>
+            </w:tcBorders>
+            <w:tcMar>
+              <w:top w:type="dxa" w:w="70"/>
+              <w:left w:type="dxa" w:w="100"/>
+              <w:bottom w:type="dxa" w:w="70"/>
+              <w:right w:type="dxa" w:w="100"/>
+            </w:tcMar>
+            <w:vAlign w:val="top"/>
+          </w:tcPr>
+          <w:p>
+            <w:pPr>
+              <w:spacing w:after="0"/>
+            </w:pPr>
+            <w:r>
+              <w:rPr>
+                <w:rFonts w:ascii="Arial" w:cs="Arial" w:eastAsia="Arial" w:hAnsi="Arial"/>
+              </w:rPr>
+              <w:t xml:space="preserve"> </w:t>
+            </w:r>
+          </w:p>
+        </w:tc>
+      </w:tr>
+      <w:tr>
+        <w:trPr>
+          <w:cantSplit/>
+          <w:tblHeader w:val="false"/>
+          <w:trHeight w:val="900" w:hRule="atLeast"/>
+        </w:trPr>
+        <w:tc>
+          <w:tcPr>
+            <w:tcW w:type="dxa" w:w="2300"/>
+            <w:tcBorders>
+              <w:top w:val="single" w:color="9A9A9A" w:sz="4"/>
+              <w:left w:val="single" w:color="9A9A9A" w:sz="4"/>
+              <w:bottom w:val="single" w:color="9A9A9A" w:sz="4"/>
+              <w:right w:val="single" w:color="9A9A9A" w:sz="4"/>
+            </w:tcBorders>
+            <w:shd w:fill="F3EFE3" w:color="auto" w:val="clear"/>
+            <w:tcMar>
+              <w:top w:type="dxa" w:w="70"/>
+              <w:left w:type="dxa" w:w="100"/>
+              <w:bottom w:type="dxa" w:w="70"/>
+              <w:right w:type="dxa" w:w="100"/>
+            </w:tcMar>
+            <w:vAlign w:val="top"/>
+          </w:tcPr>
+          <w:p>
+            <w:pPr>
+              <w:spacing w:after="40"/>
+            </w:pPr>
+            <w:r>
+              <w:rPr>
+                <w:rFonts w:ascii="Arial" w:cs="Arial" w:eastAsia="Arial" w:hAnsi="Arial"/>
+                <w:b/>
+                <w:bCs/>
+                <w:sz w:val="19"/>
+                <w:szCs w:val="19"/>
+              </w:rPr>
+              <w:t xml:space="preserve">Surface area</w:t>
             </w:r>
           </w:p>
         </w:tc>
@@ -3283,6 +3481,2168 @@
     </w:tbl>
     <w:p>
       <w:pPr>
+        <w:pStyle w:val="Heading2"/>
+        <w:keepNext/>
+      </w:pPr>
+      <w:r>
+        <w:rPr>
+          <w:rFonts w:ascii="Arial" w:cs="Arial" w:eastAsia="Arial" w:hAnsi="Arial"/>
+        </w:rPr>
+        <w:t xml:space="preserve">Part 3B · Organelle fact sheet: size, shape, and function</w:t>
+      </w:r>
+    </w:p>
+    <w:p>
+      <w:pPr>
+        <w:spacing w:after="120" w:before="0"/>
+      </w:pPr>
+      <w:r>
+        <w:rPr>
+          <w:rFonts w:ascii="Arial" w:cs="Arial" w:eastAsia="Arial" w:hAnsi="Arial"/>
+        </w:rPr>
+        <w:t xml:space="preserve">In the lab you will connect each cell part's </w:t>
+      </w:r>
+      <w:r>
+        <w:rPr>
+          <w:rFonts w:ascii="Arial" w:cs="Arial" w:eastAsia="Arial" w:hAnsi="Arial"/>
+          <w:b/>
+          <w:bCs/>
+        </w:rPr>
+        <w:t xml:space="preserve">size</w:t>
+      </w:r>
+      <w:r>
+        <w:rPr>
+          <w:rFonts w:ascii="Arial" w:cs="Arial" w:eastAsia="Arial" w:hAnsi="Arial"/>
+        </w:rPr>
+        <w:t xml:space="preserve">, </w:t>
+      </w:r>
+      <w:r>
+        <w:rPr>
+          <w:rFonts w:ascii="Arial" w:cs="Arial" w:eastAsia="Arial" w:hAnsi="Arial"/>
+          <w:b/>
+          <w:bCs/>
+        </w:rPr>
+        <w:t xml:space="preserve">shape</w:t>
+      </w:r>
+      <w:r>
+        <w:rPr>
+          <w:rFonts w:ascii="Arial" w:cs="Arial" w:eastAsia="Arial" w:hAnsi="Arial"/>
+        </w:rPr>
+        <w:t xml:space="preserve">, and </w:t>
+      </w:r>
+      <w:r>
+        <w:rPr>
+          <w:rFonts w:ascii="Arial" w:cs="Arial" w:eastAsia="Arial" w:hAnsi="Arial"/>
+          <w:b/>
+          <w:bCs/>
+        </w:rPr>
+        <w:t xml:space="preserve">job (function)</w:t>
+      </w:r>
+      <w:r>
+        <w:rPr>
+          <w:rFonts w:ascii="Arial" w:cs="Arial" w:eastAsia="Arial" w:hAnsi="Arial"/>
+        </w:rPr>
+        <w:t xml:space="preserve"> to your scale calculations. Research each organelle below using your class notes, your textbook, and trusted sources. Fill in the table. Sizes are approximate, and it is OK if your numbers are a little different from a classmate's.</w:t>
+      </w:r>
+    </w:p>
+    <w:tbl>
+      <w:tblPr>
+        <w:tblW w:type="dxa" w:w="10080"/>
+        <w:tblBorders>
+          <w:top w:val="single" w:color="auto" w:sz="4"/>
+          <w:left w:val="single" w:color="auto" w:sz="4"/>
+          <w:bottom w:val="single" w:color="auto" w:sz="4"/>
+          <w:right w:val="single" w:color="auto" w:sz="4"/>
+          <w:insideH w:val="single" w:color="auto" w:sz="4"/>
+          <w:insideV w:val="single" w:color="auto" w:sz="4"/>
+        </w:tblBorders>
+        <w:tblLayout w:type="fixed"/>
+      </w:tblPr>
+      <w:tblGrid>
+        <w:gridCol w:w="1900"/>
+        <w:gridCol w:w="2300"/>
+        <w:gridCol w:w="1900"/>
+        <w:gridCol w:w="1400"/>
+        <w:gridCol w:w="2580"/>
+      </w:tblGrid>
+      <w:tr>
+        <w:trPr>
+          <w:cantSplit/>
+          <w:tblHeader/>
+        </w:trPr>
+        <w:tc>
+          <w:tcPr>
+            <w:tcW w:type="dxa" w:w="1900"/>
+            <w:tcBorders>
+              <w:top w:val="single" w:color="9A9A9A" w:sz="4"/>
+              <w:left w:val="single" w:color="9A9A9A" w:sz="4"/>
+              <w:bottom w:val="single" w:color="9A9A9A" w:sz="4"/>
+              <w:right w:val="single" w:color="9A9A9A" w:sz="4"/>
+            </w:tcBorders>
+            <w:shd w:fill="E9E2D0" w:color="auto" w:val="clear"/>
+            <w:tcMar>
+              <w:top w:type="dxa" w:w="70"/>
+              <w:left w:type="dxa" w:w="100"/>
+              <w:bottom w:type="dxa" w:w="70"/>
+              <w:right w:type="dxa" w:w="100"/>
+            </w:tcMar>
+            <w:vAlign w:val="center"/>
+          </w:tcPr>
+          <w:p>
+            <w:pPr>
+              <w:spacing w:after="40"/>
+            </w:pPr>
+            <w:r>
+              <w:rPr>
+                <w:rFonts w:ascii="Arial" w:cs="Arial" w:eastAsia="Arial" w:hAnsi="Arial"/>
+                <w:b/>
+                <w:bCs/>
+                <w:sz w:val="17"/>
+                <w:szCs w:val="17"/>
+              </w:rPr>
+              <w:t xml:space="preserve">Organelle</w:t>
+            </w:r>
+          </w:p>
+        </w:tc>
+        <w:tc>
+          <w:tcPr>
+            <w:tcW w:type="dxa" w:w="2300"/>
+            <w:tcBorders>
+              <w:top w:val="single" w:color="9A9A9A" w:sz="4"/>
+              <w:left w:val="single" w:color="9A9A9A" w:sz="4"/>
+              <w:bottom w:val="single" w:color="9A9A9A" w:sz="4"/>
+              <w:right w:val="single" w:color="9A9A9A" w:sz="4"/>
+            </w:tcBorders>
+            <w:shd w:fill="E9E2D0" w:color="auto" w:val="clear"/>
+            <w:tcMar>
+              <w:top w:type="dxa" w:w="70"/>
+              <w:left w:type="dxa" w:w="100"/>
+              <w:bottom w:type="dxa" w:w="70"/>
+              <w:right w:type="dxa" w:w="100"/>
+            </w:tcMar>
+            <w:vAlign w:val="center"/>
+          </w:tcPr>
+          <w:p>
+            <w:pPr>
+              <w:spacing w:after="40"/>
+            </w:pPr>
+            <w:r>
+              <w:rPr>
+                <w:rFonts w:ascii="Arial" w:cs="Arial" w:eastAsia="Arial" w:hAnsi="Arial"/>
+                <w:b/>
+                <w:bCs/>
+                <w:sz w:val="17"/>
+                <w:szCs w:val="17"/>
+              </w:rPr>
+              <w:t xml:space="preserve">Job (function)</w:t>
+            </w:r>
+          </w:p>
+        </w:tc>
+        <w:tc>
+          <w:tcPr>
+            <w:tcW w:type="dxa" w:w="1900"/>
+            <w:tcBorders>
+              <w:top w:val="single" w:color="9A9A9A" w:sz="4"/>
+              <w:left w:val="single" w:color="9A9A9A" w:sz="4"/>
+              <w:bottom w:val="single" w:color="9A9A9A" w:sz="4"/>
+              <w:right w:val="single" w:color="9A9A9A" w:sz="4"/>
+            </w:tcBorders>
+            <w:shd w:fill="E9E2D0" w:color="auto" w:val="clear"/>
+            <w:tcMar>
+              <w:top w:type="dxa" w:w="70"/>
+              <w:left w:type="dxa" w:w="100"/>
+              <w:bottom w:type="dxa" w:w="70"/>
+              <w:right w:type="dxa" w:w="100"/>
+            </w:tcMar>
+            <w:vAlign w:val="center"/>
+          </w:tcPr>
+          <w:p>
+            <w:pPr>
+              <w:spacing w:after="40"/>
+            </w:pPr>
+            <w:r>
+              <w:rPr>
+                <w:rFonts w:ascii="Arial" w:cs="Arial" w:eastAsia="Arial" w:hAnsi="Arial"/>
+                <w:b/>
+                <w:bCs/>
+                <w:sz w:val="17"/>
+                <w:szCs w:val="17"/>
+              </w:rPr>
+              <w:t xml:space="preserve">Shape (describe or sketch)</w:t>
+            </w:r>
+          </w:p>
+        </w:tc>
+        <w:tc>
+          <w:tcPr>
+            <w:tcW w:type="dxa" w:w="1400"/>
+            <w:tcBorders>
+              <w:top w:val="single" w:color="9A9A9A" w:sz="4"/>
+              <w:left w:val="single" w:color="9A9A9A" w:sz="4"/>
+              <w:bottom w:val="single" w:color="9A9A9A" w:sz="4"/>
+              <w:right w:val="single" w:color="9A9A9A" w:sz="4"/>
+            </w:tcBorders>
+            <w:shd w:fill="E9E2D0" w:color="auto" w:val="clear"/>
+            <w:tcMar>
+              <w:top w:type="dxa" w:w="70"/>
+              <w:left w:type="dxa" w:w="100"/>
+              <w:bottom w:type="dxa" w:w="70"/>
+              <w:right w:type="dxa" w:w="100"/>
+            </w:tcMar>
+            <w:vAlign w:val="center"/>
+          </w:tcPr>
+          <w:p>
+            <w:pPr>
+              <w:spacing w:after="40"/>
+            </w:pPr>
+            <w:r>
+              <w:rPr>
+                <w:rFonts w:ascii="Arial" w:cs="Arial" w:eastAsia="Arial" w:hAnsi="Arial"/>
+                <w:b/>
+                <w:bCs/>
+                <w:sz w:val="17"/>
+                <w:szCs w:val="17"/>
+              </w:rPr>
+              <w:t xml:space="preserve">Typical size (µm)</w:t>
+            </w:r>
+          </w:p>
+        </w:tc>
+        <w:tc>
+          <w:tcPr>
+            <w:tcW w:type="dxa" w:w="2580"/>
+            <w:tcBorders>
+              <w:top w:val="single" w:color="9A9A9A" w:sz="4"/>
+              <w:left w:val="single" w:color="9A9A9A" w:sz="4"/>
+              <w:bottom w:val="single" w:color="9A9A9A" w:sz="4"/>
+              <w:right w:val="single" w:color="9A9A9A" w:sz="4"/>
+            </w:tcBorders>
+            <w:shd w:fill="E9E2D0" w:color="auto" w:val="clear"/>
+            <w:tcMar>
+              <w:top w:type="dxa" w:w="70"/>
+              <w:left w:type="dxa" w:w="100"/>
+              <w:bottom w:type="dxa" w:w="70"/>
+              <w:right w:type="dxa" w:w="100"/>
+            </w:tcMar>
+            <w:vAlign w:val="center"/>
+          </w:tcPr>
+          <w:p>
+            <w:pPr>
+              <w:spacing w:after="40"/>
+            </w:pPr>
+            <w:r>
+              <w:rPr>
+                <w:rFonts w:ascii="Arial" w:cs="Arial" w:eastAsia="Arial" w:hAnsi="Arial"/>
+                <w:b/>
+                <w:bCs/>
+                <w:sz w:val="17"/>
+                <w:szCs w:val="17"/>
+              </w:rPr>
+              <w:t xml:space="preserve">Found in plant cells, animal cells, or both? Source</w:t>
+            </w:r>
+          </w:p>
+        </w:tc>
+      </w:tr>
+      <w:tr>
+        <w:trPr>
+          <w:cantSplit/>
+          <w:tblHeader w:val="false"/>
+          <w:trHeight w:val="700" w:hRule="atLeast"/>
+        </w:trPr>
+        <w:tc>
+          <w:tcPr>
+            <w:tcW w:type="dxa" w:w="1900"/>
+            <w:tcBorders>
+              <w:top w:val="single" w:color="9A9A9A" w:sz="4"/>
+              <w:left w:val="single" w:color="9A9A9A" w:sz="4"/>
+              <w:bottom w:val="single" w:color="9A9A9A" w:sz="4"/>
+              <w:right w:val="single" w:color="9A9A9A" w:sz="4"/>
+            </w:tcBorders>
+            <w:shd w:fill="F3EFE3" w:color="auto" w:val="clear"/>
+            <w:tcMar>
+              <w:top w:type="dxa" w:w="70"/>
+              <w:left w:type="dxa" w:w="100"/>
+              <w:bottom w:type="dxa" w:w="70"/>
+              <w:right w:type="dxa" w:w="100"/>
+            </w:tcMar>
+            <w:vAlign w:val="top"/>
+          </w:tcPr>
+          <w:p>
+            <w:pPr>
+              <w:spacing w:after="40"/>
+            </w:pPr>
+            <w:r>
+              <w:rPr>
+                <w:rFonts w:ascii="Arial" w:cs="Arial" w:eastAsia="Arial" w:hAnsi="Arial"/>
+                <w:b/>
+                <w:bCs/>
+                <w:sz w:val="17"/>
+                <w:szCs w:val="17"/>
+              </w:rPr>
+              <w:t xml:space="preserve">Cell wall (plant cells)</w:t>
+            </w:r>
+          </w:p>
+        </w:tc>
+        <w:tc>
+          <w:tcPr>
+            <w:tcW w:type="dxa" w:w="2300"/>
+            <w:tcBorders>
+              <w:top w:val="single" w:color="9A9A9A" w:sz="4"/>
+              <w:left w:val="single" w:color="9A9A9A" w:sz="4"/>
+              <w:bottom w:val="single" w:color="9A9A9A" w:sz="4"/>
+              <w:right w:val="single" w:color="9A9A9A" w:sz="4"/>
+            </w:tcBorders>
+            <w:tcMar>
+              <w:top w:type="dxa" w:w="70"/>
+              <w:left w:type="dxa" w:w="100"/>
+              <w:bottom w:type="dxa" w:w="70"/>
+              <w:right w:type="dxa" w:w="100"/>
+            </w:tcMar>
+            <w:vAlign w:val="top"/>
+          </w:tcPr>
+          <w:p>
+            <w:pPr>
+              <w:spacing w:after="0"/>
+            </w:pPr>
+            <w:r>
+              <w:rPr>
+                <w:rFonts w:ascii="Arial" w:cs="Arial" w:eastAsia="Arial" w:hAnsi="Arial"/>
+              </w:rPr>
+              <w:t xml:space="preserve"> </w:t>
+            </w:r>
+          </w:p>
+        </w:tc>
+        <w:tc>
+          <w:tcPr>
+            <w:tcW w:type="dxa" w:w="1900"/>
+            <w:tcBorders>
+              <w:top w:val="single" w:color="9A9A9A" w:sz="4"/>
+              <w:left w:val="single" w:color="9A9A9A" w:sz="4"/>
+              <w:bottom w:val="single" w:color="9A9A9A" w:sz="4"/>
+              <w:right w:val="single" w:color="9A9A9A" w:sz="4"/>
+            </w:tcBorders>
+            <w:tcMar>
+              <w:top w:type="dxa" w:w="70"/>
+              <w:left w:type="dxa" w:w="100"/>
+              <w:bottom w:type="dxa" w:w="70"/>
+              <w:right w:type="dxa" w:w="100"/>
+            </w:tcMar>
+            <w:vAlign w:val="top"/>
+          </w:tcPr>
+          <w:p>
+            <w:pPr>
+              <w:spacing w:after="0"/>
+            </w:pPr>
+            <w:r>
+              <w:rPr>
+                <w:rFonts w:ascii="Arial" w:cs="Arial" w:eastAsia="Arial" w:hAnsi="Arial"/>
+              </w:rPr>
+              <w:t xml:space="preserve"> </w:t>
+            </w:r>
+          </w:p>
+        </w:tc>
+        <w:tc>
+          <w:tcPr>
+            <w:tcW w:type="dxa" w:w="1400"/>
+            <w:tcBorders>
+              <w:top w:val="single" w:color="9A9A9A" w:sz="4"/>
+              <w:left w:val="single" w:color="9A9A9A" w:sz="4"/>
+              <w:bottom w:val="single" w:color="9A9A9A" w:sz="4"/>
+              <w:right w:val="single" w:color="9A9A9A" w:sz="4"/>
+            </w:tcBorders>
+            <w:tcMar>
+              <w:top w:type="dxa" w:w="70"/>
+              <w:left w:type="dxa" w:w="100"/>
+              <w:bottom w:type="dxa" w:w="70"/>
+              <w:right w:type="dxa" w:w="100"/>
+            </w:tcMar>
+            <w:vAlign w:val="top"/>
+          </w:tcPr>
+          <w:p>
+            <w:pPr>
+              <w:spacing w:after="0"/>
+            </w:pPr>
+            <w:r>
+              <w:rPr>
+                <w:rFonts w:ascii="Arial" w:cs="Arial" w:eastAsia="Arial" w:hAnsi="Arial"/>
+              </w:rPr>
+              <w:t xml:space="preserve"> </w:t>
+            </w:r>
+          </w:p>
+        </w:tc>
+        <w:tc>
+          <w:tcPr>
+            <w:tcW w:type="dxa" w:w="2580"/>
+            <w:tcBorders>
+              <w:top w:val="single" w:color="9A9A9A" w:sz="4"/>
+              <w:left w:val="single" w:color="9A9A9A" w:sz="4"/>
+              <w:bottom w:val="single" w:color="9A9A9A" w:sz="4"/>
+              <w:right w:val="single" w:color="9A9A9A" w:sz="4"/>
+            </w:tcBorders>
+            <w:tcMar>
+              <w:top w:type="dxa" w:w="70"/>
+              <w:left w:type="dxa" w:w="100"/>
+              <w:bottom w:type="dxa" w:w="70"/>
+              <w:right w:type="dxa" w:w="100"/>
+            </w:tcMar>
+            <w:vAlign w:val="top"/>
+          </w:tcPr>
+          <w:p>
+            <w:pPr>
+              <w:spacing w:after="0"/>
+            </w:pPr>
+            <w:r>
+              <w:rPr>
+                <w:rFonts w:ascii="Arial" w:cs="Arial" w:eastAsia="Arial" w:hAnsi="Arial"/>
+              </w:rPr>
+              <w:t xml:space="preserve"> </w:t>
+            </w:r>
+          </w:p>
+        </w:tc>
+      </w:tr>
+      <w:tr>
+        <w:trPr>
+          <w:cantSplit/>
+          <w:tblHeader w:val="false"/>
+          <w:trHeight w:val="700" w:hRule="atLeast"/>
+        </w:trPr>
+        <w:tc>
+          <w:tcPr>
+            <w:tcW w:type="dxa" w:w="1900"/>
+            <w:tcBorders>
+              <w:top w:val="single" w:color="9A9A9A" w:sz="4"/>
+              <w:left w:val="single" w:color="9A9A9A" w:sz="4"/>
+              <w:bottom w:val="single" w:color="9A9A9A" w:sz="4"/>
+              <w:right w:val="single" w:color="9A9A9A" w:sz="4"/>
+            </w:tcBorders>
+            <w:shd w:fill="F3EFE3" w:color="auto" w:val="clear"/>
+            <w:tcMar>
+              <w:top w:type="dxa" w:w="70"/>
+              <w:left w:type="dxa" w:w="100"/>
+              <w:bottom w:type="dxa" w:w="70"/>
+              <w:right w:type="dxa" w:w="100"/>
+            </w:tcMar>
+            <w:vAlign w:val="top"/>
+          </w:tcPr>
+          <w:p>
+            <w:pPr>
+              <w:spacing w:after="40"/>
+            </w:pPr>
+            <w:r>
+              <w:rPr>
+                <w:rFonts w:ascii="Arial" w:cs="Arial" w:eastAsia="Arial" w:hAnsi="Arial"/>
+                <w:b/>
+                <w:bCs/>
+                <w:sz w:val="17"/>
+                <w:szCs w:val="17"/>
+              </w:rPr>
+              <w:t xml:space="preserve">Cell membrane</w:t>
+            </w:r>
+          </w:p>
+        </w:tc>
+        <w:tc>
+          <w:tcPr>
+            <w:tcW w:type="dxa" w:w="2300"/>
+            <w:tcBorders>
+              <w:top w:val="single" w:color="9A9A9A" w:sz="4"/>
+              <w:left w:val="single" w:color="9A9A9A" w:sz="4"/>
+              <w:bottom w:val="single" w:color="9A9A9A" w:sz="4"/>
+              <w:right w:val="single" w:color="9A9A9A" w:sz="4"/>
+            </w:tcBorders>
+            <w:tcMar>
+              <w:top w:type="dxa" w:w="70"/>
+              <w:left w:type="dxa" w:w="100"/>
+              <w:bottom w:type="dxa" w:w="70"/>
+              <w:right w:type="dxa" w:w="100"/>
+            </w:tcMar>
+            <w:vAlign w:val="top"/>
+          </w:tcPr>
+          <w:p>
+            <w:pPr>
+              <w:spacing w:after="0"/>
+            </w:pPr>
+            <w:r>
+              <w:rPr>
+                <w:rFonts w:ascii="Arial" w:cs="Arial" w:eastAsia="Arial" w:hAnsi="Arial"/>
+              </w:rPr>
+              <w:t xml:space="preserve"> </w:t>
+            </w:r>
+          </w:p>
+        </w:tc>
+        <w:tc>
+          <w:tcPr>
+            <w:tcW w:type="dxa" w:w="1900"/>
+            <w:tcBorders>
+              <w:top w:val="single" w:color="9A9A9A" w:sz="4"/>
+              <w:left w:val="single" w:color="9A9A9A" w:sz="4"/>
+              <w:bottom w:val="single" w:color="9A9A9A" w:sz="4"/>
+              <w:right w:val="single" w:color="9A9A9A" w:sz="4"/>
+            </w:tcBorders>
+            <w:tcMar>
+              <w:top w:type="dxa" w:w="70"/>
+              <w:left w:type="dxa" w:w="100"/>
+              <w:bottom w:type="dxa" w:w="70"/>
+              <w:right w:type="dxa" w:w="100"/>
+            </w:tcMar>
+            <w:vAlign w:val="top"/>
+          </w:tcPr>
+          <w:p>
+            <w:pPr>
+              <w:spacing w:after="0"/>
+            </w:pPr>
+            <w:r>
+              <w:rPr>
+                <w:rFonts w:ascii="Arial" w:cs="Arial" w:eastAsia="Arial" w:hAnsi="Arial"/>
+              </w:rPr>
+              <w:t xml:space="preserve"> </w:t>
+            </w:r>
+          </w:p>
+        </w:tc>
+        <w:tc>
+          <w:tcPr>
+            <w:tcW w:type="dxa" w:w="1400"/>
+            <w:tcBorders>
+              <w:top w:val="single" w:color="9A9A9A" w:sz="4"/>
+              <w:left w:val="single" w:color="9A9A9A" w:sz="4"/>
+              <w:bottom w:val="single" w:color="9A9A9A" w:sz="4"/>
+              <w:right w:val="single" w:color="9A9A9A" w:sz="4"/>
+            </w:tcBorders>
+            <w:tcMar>
+              <w:top w:type="dxa" w:w="70"/>
+              <w:left w:type="dxa" w:w="100"/>
+              <w:bottom w:type="dxa" w:w="70"/>
+              <w:right w:type="dxa" w:w="100"/>
+            </w:tcMar>
+            <w:vAlign w:val="top"/>
+          </w:tcPr>
+          <w:p>
+            <w:pPr>
+              <w:spacing w:after="0"/>
+            </w:pPr>
+            <w:r>
+              <w:rPr>
+                <w:rFonts w:ascii="Arial" w:cs="Arial" w:eastAsia="Arial" w:hAnsi="Arial"/>
+              </w:rPr>
+              <w:t xml:space="preserve"> </w:t>
+            </w:r>
+          </w:p>
+        </w:tc>
+        <w:tc>
+          <w:tcPr>
+            <w:tcW w:type="dxa" w:w="2580"/>
+            <w:tcBorders>
+              <w:top w:val="single" w:color="9A9A9A" w:sz="4"/>
+              <w:left w:val="single" w:color="9A9A9A" w:sz="4"/>
+              <w:bottom w:val="single" w:color="9A9A9A" w:sz="4"/>
+              <w:right w:val="single" w:color="9A9A9A" w:sz="4"/>
+            </w:tcBorders>
+            <w:tcMar>
+              <w:top w:type="dxa" w:w="70"/>
+              <w:left w:type="dxa" w:w="100"/>
+              <w:bottom w:type="dxa" w:w="70"/>
+              <w:right w:type="dxa" w:w="100"/>
+            </w:tcMar>
+            <w:vAlign w:val="top"/>
+          </w:tcPr>
+          <w:p>
+            <w:pPr>
+              <w:spacing w:after="0"/>
+            </w:pPr>
+            <w:r>
+              <w:rPr>
+                <w:rFonts w:ascii="Arial" w:cs="Arial" w:eastAsia="Arial" w:hAnsi="Arial"/>
+              </w:rPr>
+              <w:t xml:space="preserve"> </w:t>
+            </w:r>
+          </w:p>
+        </w:tc>
+      </w:tr>
+      <w:tr>
+        <w:trPr>
+          <w:cantSplit/>
+          <w:tblHeader w:val="false"/>
+          <w:trHeight w:val="700" w:hRule="atLeast"/>
+        </w:trPr>
+        <w:tc>
+          <w:tcPr>
+            <w:tcW w:type="dxa" w:w="1900"/>
+            <w:tcBorders>
+              <w:top w:val="single" w:color="9A9A9A" w:sz="4"/>
+              <w:left w:val="single" w:color="9A9A9A" w:sz="4"/>
+              <w:bottom w:val="single" w:color="9A9A9A" w:sz="4"/>
+              <w:right w:val="single" w:color="9A9A9A" w:sz="4"/>
+            </w:tcBorders>
+            <w:shd w:fill="F3EFE3" w:color="auto" w:val="clear"/>
+            <w:tcMar>
+              <w:top w:type="dxa" w:w="70"/>
+              <w:left w:type="dxa" w:w="100"/>
+              <w:bottom w:type="dxa" w:w="70"/>
+              <w:right w:type="dxa" w:w="100"/>
+            </w:tcMar>
+            <w:vAlign w:val="top"/>
+          </w:tcPr>
+          <w:p>
+            <w:pPr>
+              <w:spacing w:after="40"/>
+            </w:pPr>
+            <w:r>
+              <w:rPr>
+                <w:rFonts w:ascii="Arial" w:cs="Arial" w:eastAsia="Arial" w:hAnsi="Arial"/>
+                <w:b/>
+                <w:bCs/>
+                <w:sz w:val="17"/>
+                <w:szCs w:val="17"/>
+              </w:rPr>
+              <w:t xml:space="preserve">Nucleus</w:t>
+            </w:r>
+          </w:p>
+        </w:tc>
+        <w:tc>
+          <w:tcPr>
+            <w:tcW w:type="dxa" w:w="2300"/>
+            <w:tcBorders>
+              <w:top w:val="single" w:color="9A9A9A" w:sz="4"/>
+              <w:left w:val="single" w:color="9A9A9A" w:sz="4"/>
+              <w:bottom w:val="single" w:color="9A9A9A" w:sz="4"/>
+              <w:right w:val="single" w:color="9A9A9A" w:sz="4"/>
+            </w:tcBorders>
+            <w:tcMar>
+              <w:top w:type="dxa" w:w="70"/>
+              <w:left w:type="dxa" w:w="100"/>
+              <w:bottom w:type="dxa" w:w="70"/>
+              <w:right w:type="dxa" w:w="100"/>
+            </w:tcMar>
+            <w:vAlign w:val="top"/>
+          </w:tcPr>
+          <w:p>
+            <w:pPr>
+              <w:spacing w:after="0"/>
+            </w:pPr>
+            <w:r>
+              <w:rPr>
+                <w:rFonts w:ascii="Arial" w:cs="Arial" w:eastAsia="Arial" w:hAnsi="Arial"/>
+              </w:rPr>
+              <w:t xml:space="preserve"> </w:t>
+            </w:r>
+          </w:p>
+        </w:tc>
+        <w:tc>
+          <w:tcPr>
+            <w:tcW w:type="dxa" w:w="1900"/>
+            <w:tcBorders>
+              <w:top w:val="single" w:color="9A9A9A" w:sz="4"/>
+              <w:left w:val="single" w:color="9A9A9A" w:sz="4"/>
+              <w:bottom w:val="single" w:color="9A9A9A" w:sz="4"/>
+              <w:right w:val="single" w:color="9A9A9A" w:sz="4"/>
+            </w:tcBorders>
+            <w:tcMar>
+              <w:top w:type="dxa" w:w="70"/>
+              <w:left w:type="dxa" w:w="100"/>
+              <w:bottom w:type="dxa" w:w="70"/>
+              <w:right w:type="dxa" w:w="100"/>
+            </w:tcMar>
+            <w:vAlign w:val="top"/>
+          </w:tcPr>
+          <w:p>
+            <w:pPr>
+              <w:spacing w:after="0"/>
+            </w:pPr>
+            <w:r>
+              <w:rPr>
+                <w:rFonts w:ascii="Arial" w:cs="Arial" w:eastAsia="Arial" w:hAnsi="Arial"/>
+              </w:rPr>
+              <w:t xml:space="preserve"> </w:t>
+            </w:r>
+          </w:p>
+        </w:tc>
+        <w:tc>
+          <w:tcPr>
+            <w:tcW w:type="dxa" w:w="1400"/>
+            <w:tcBorders>
+              <w:top w:val="single" w:color="9A9A9A" w:sz="4"/>
+              <w:left w:val="single" w:color="9A9A9A" w:sz="4"/>
+              <w:bottom w:val="single" w:color="9A9A9A" w:sz="4"/>
+              <w:right w:val="single" w:color="9A9A9A" w:sz="4"/>
+            </w:tcBorders>
+            <w:tcMar>
+              <w:top w:type="dxa" w:w="70"/>
+              <w:left w:type="dxa" w:w="100"/>
+              <w:bottom w:type="dxa" w:w="70"/>
+              <w:right w:type="dxa" w:w="100"/>
+            </w:tcMar>
+            <w:vAlign w:val="top"/>
+          </w:tcPr>
+          <w:p>
+            <w:pPr>
+              <w:spacing w:after="0"/>
+            </w:pPr>
+            <w:r>
+              <w:rPr>
+                <w:rFonts w:ascii="Arial" w:cs="Arial" w:eastAsia="Arial" w:hAnsi="Arial"/>
+              </w:rPr>
+              <w:t xml:space="preserve"> </w:t>
+            </w:r>
+          </w:p>
+        </w:tc>
+        <w:tc>
+          <w:tcPr>
+            <w:tcW w:type="dxa" w:w="2580"/>
+            <w:tcBorders>
+              <w:top w:val="single" w:color="9A9A9A" w:sz="4"/>
+              <w:left w:val="single" w:color="9A9A9A" w:sz="4"/>
+              <w:bottom w:val="single" w:color="9A9A9A" w:sz="4"/>
+              <w:right w:val="single" w:color="9A9A9A" w:sz="4"/>
+            </w:tcBorders>
+            <w:tcMar>
+              <w:top w:type="dxa" w:w="70"/>
+              <w:left w:type="dxa" w:w="100"/>
+              <w:bottom w:type="dxa" w:w="70"/>
+              <w:right w:type="dxa" w:w="100"/>
+            </w:tcMar>
+            <w:vAlign w:val="top"/>
+          </w:tcPr>
+          <w:p>
+            <w:pPr>
+              <w:spacing w:after="0"/>
+            </w:pPr>
+            <w:r>
+              <w:rPr>
+                <w:rFonts w:ascii="Arial" w:cs="Arial" w:eastAsia="Arial" w:hAnsi="Arial"/>
+              </w:rPr>
+              <w:t xml:space="preserve"> </w:t>
+            </w:r>
+          </w:p>
+        </w:tc>
+      </w:tr>
+      <w:tr>
+        <w:trPr>
+          <w:cantSplit/>
+          <w:tblHeader w:val="false"/>
+          <w:trHeight w:val="700" w:hRule="atLeast"/>
+        </w:trPr>
+        <w:tc>
+          <w:tcPr>
+            <w:tcW w:type="dxa" w:w="1900"/>
+            <w:tcBorders>
+              <w:top w:val="single" w:color="9A9A9A" w:sz="4"/>
+              <w:left w:val="single" w:color="9A9A9A" w:sz="4"/>
+              <w:bottom w:val="single" w:color="9A9A9A" w:sz="4"/>
+              <w:right w:val="single" w:color="9A9A9A" w:sz="4"/>
+            </w:tcBorders>
+            <w:shd w:fill="F3EFE3" w:color="auto" w:val="clear"/>
+            <w:tcMar>
+              <w:top w:type="dxa" w:w="70"/>
+              <w:left w:type="dxa" w:w="100"/>
+              <w:bottom w:type="dxa" w:w="70"/>
+              <w:right w:type="dxa" w:w="100"/>
+            </w:tcMar>
+            <w:vAlign w:val="top"/>
+          </w:tcPr>
+          <w:p>
+            <w:pPr>
+              <w:spacing w:after="40"/>
+            </w:pPr>
+            <w:r>
+              <w:rPr>
+                <w:rFonts w:ascii="Arial" w:cs="Arial" w:eastAsia="Arial" w:hAnsi="Arial"/>
+                <w:b/>
+                <w:bCs/>
+                <w:sz w:val="17"/>
+                <w:szCs w:val="17"/>
+              </w:rPr>
+              <w:t xml:space="preserve">Chloroplast</w:t>
+            </w:r>
+          </w:p>
+        </w:tc>
+        <w:tc>
+          <w:tcPr>
+            <w:tcW w:type="dxa" w:w="2300"/>
+            <w:tcBorders>
+              <w:top w:val="single" w:color="9A9A9A" w:sz="4"/>
+              <w:left w:val="single" w:color="9A9A9A" w:sz="4"/>
+              <w:bottom w:val="single" w:color="9A9A9A" w:sz="4"/>
+              <w:right w:val="single" w:color="9A9A9A" w:sz="4"/>
+            </w:tcBorders>
+            <w:tcMar>
+              <w:top w:type="dxa" w:w="70"/>
+              <w:left w:type="dxa" w:w="100"/>
+              <w:bottom w:type="dxa" w:w="70"/>
+              <w:right w:type="dxa" w:w="100"/>
+            </w:tcMar>
+            <w:vAlign w:val="top"/>
+          </w:tcPr>
+          <w:p>
+            <w:pPr>
+              <w:spacing w:after="0"/>
+            </w:pPr>
+            <w:r>
+              <w:rPr>
+                <w:rFonts w:ascii="Arial" w:cs="Arial" w:eastAsia="Arial" w:hAnsi="Arial"/>
+              </w:rPr>
+              <w:t xml:space="preserve"> </w:t>
+            </w:r>
+          </w:p>
+        </w:tc>
+        <w:tc>
+          <w:tcPr>
+            <w:tcW w:type="dxa" w:w="1900"/>
+            <w:tcBorders>
+              <w:top w:val="single" w:color="9A9A9A" w:sz="4"/>
+              <w:left w:val="single" w:color="9A9A9A" w:sz="4"/>
+              <w:bottom w:val="single" w:color="9A9A9A" w:sz="4"/>
+              <w:right w:val="single" w:color="9A9A9A" w:sz="4"/>
+            </w:tcBorders>
+            <w:tcMar>
+              <w:top w:type="dxa" w:w="70"/>
+              <w:left w:type="dxa" w:w="100"/>
+              <w:bottom w:type="dxa" w:w="70"/>
+              <w:right w:type="dxa" w:w="100"/>
+            </w:tcMar>
+            <w:vAlign w:val="top"/>
+          </w:tcPr>
+          <w:p>
+            <w:pPr>
+              <w:spacing w:after="0"/>
+            </w:pPr>
+            <w:r>
+              <w:rPr>
+                <w:rFonts w:ascii="Arial" w:cs="Arial" w:eastAsia="Arial" w:hAnsi="Arial"/>
+              </w:rPr>
+              <w:t xml:space="preserve"> </w:t>
+            </w:r>
+          </w:p>
+        </w:tc>
+        <w:tc>
+          <w:tcPr>
+            <w:tcW w:type="dxa" w:w="1400"/>
+            <w:tcBorders>
+              <w:top w:val="single" w:color="9A9A9A" w:sz="4"/>
+              <w:left w:val="single" w:color="9A9A9A" w:sz="4"/>
+              <w:bottom w:val="single" w:color="9A9A9A" w:sz="4"/>
+              <w:right w:val="single" w:color="9A9A9A" w:sz="4"/>
+            </w:tcBorders>
+            <w:tcMar>
+              <w:top w:type="dxa" w:w="70"/>
+              <w:left w:type="dxa" w:w="100"/>
+              <w:bottom w:type="dxa" w:w="70"/>
+              <w:right w:type="dxa" w:w="100"/>
+            </w:tcMar>
+            <w:vAlign w:val="top"/>
+          </w:tcPr>
+          <w:p>
+            <w:pPr>
+              <w:spacing w:after="0"/>
+            </w:pPr>
+            <w:r>
+              <w:rPr>
+                <w:rFonts w:ascii="Arial" w:cs="Arial" w:eastAsia="Arial" w:hAnsi="Arial"/>
+              </w:rPr>
+              <w:t xml:space="preserve"> </w:t>
+            </w:r>
+          </w:p>
+        </w:tc>
+        <w:tc>
+          <w:tcPr>
+            <w:tcW w:type="dxa" w:w="2580"/>
+            <w:tcBorders>
+              <w:top w:val="single" w:color="9A9A9A" w:sz="4"/>
+              <w:left w:val="single" w:color="9A9A9A" w:sz="4"/>
+              <w:bottom w:val="single" w:color="9A9A9A" w:sz="4"/>
+              <w:right w:val="single" w:color="9A9A9A" w:sz="4"/>
+            </w:tcBorders>
+            <w:tcMar>
+              <w:top w:type="dxa" w:w="70"/>
+              <w:left w:type="dxa" w:w="100"/>
+              <w:bottom w:type="dxa" w:w="70"/>
+              <w:right w:type="dxa" w:w="100"/>
+            </w:tcMar>
+            <w:vAlign w:val="top"/>
+          </w:tcPr>
+          <w:p>
+            <w:pPr>
+              <w:spacing w:after="0"/>
+            </w:pPr>
+            <w:r>
+              <w:rPr>
+                <w:rFonts w:ascii="Arial" w:cs="Arial" w:eastAsia="Arial" w:hAnsi="Arial"/>
+              </w:rPr>
+              <w:t xml:space="preserve"> </w:t>
+            </w:r>
+          </w:p>
+        </w:tc>
+      </w:tr>
+      <w:tr>
+        <w:trPr>
+          <w:cantSplit/>
+          <w:tblHeader w:val="false"/>
+          <w:trHeight w:val="700" w:hRule="atLeast"/>
+        </w:trPr>
+        <w:tc>
+          <w:tcPr>
+            <w:tcW w:type="dxa" w:w="1900"/>
+            <w:tcBorders>
+              <w:top w:val="single" w:color="9A9A9A" w:sz="4"/>
+              <w:left w:val="single" w:color="9A9A9A" w:sz="4"/>
+              <w:bottom w:val="single" w:color="9A9A9A" w:sz="4"/>
+              <w:right w:val="single" w:color="9A9A9A" w:sz="4"/>
+            </w:tcBorders>
+            <w:shd w:fill="F3EFE3" w:color="auto" w:val="clear"/>
+            <w:tcMar>
+              <w:top w:type="dxa" w:w="70"/>
+              <w:left w:type="dxa" w:w="100"/>
+              <w:bottom w:type="dxa" w:w="70"/>
+              <w:right w:type="dxa" w:w="100"/>
+            </w:tcMar>
+            <w:vAlign w:val="top"/>
+          </w:tcPr>
+          <w:p>
+            <w:pPr>
+              <w:spacing w:after="40"/>
+            </w:pPr>
+            <w:r>
+              <w:rPr>
+                <w:rFonts w:ascii="Arial" w:cs="Arial" w:eastAsia="Arial" w:hAnsi="Arial"/>
+                <w:b/>
+                <w:bCs/>
+                <w:sz w:val="17"/>
+                <w:szCs w:val="17"/>
+              </w:rPr>
+              <w:t xml:space="preserve">Mitochondrion</w:t>
+            </w:r>
+          </w:p>
+        </w:tc>
+        <w:tc>
+          <w:tcPr>
+            <w:tcW w:type="dxa" w:w="2300"/>
+            <w:tcBorders>
+              <w:top w:val="single" w:color="9A9A9A" w:sz="4"/>
+              <w:left w:val="single" w:color="9A9A9A" w:sz="4"/>
+              <w:bottom w:val="single" w:color="9A9A9A" w:sz="4"/>
+              <w:right w:val="single" w:color="9A9A9A" w:sz="4"/>
+            </w:tcBorders>
+            <w:tcMar>
+              <w:top w:type="dxa" w:w="70"/>
+              <w:left w:type="dxa" w:w="100"/>
+              <w:bottom w:type="dxa" w:w="70"/>
+              <w:right w:type="dxa" w:w="100"/>
+            </w:tcMar>
+            <w:vAlign w:val="top"/>
+          </w:tcPr>
+          <w:p>
+            <w:pPr>
+              <w:spacing w:after="0"/>
+            </w:pPr>
+            <w:r>
+              <w:rPr>
+                <w:rFonts w:ascii="Arial" w:cs="Arial" w:eastAsia="Arial" w:hAnsi="Arial"/>
+              </w:rPr>
+              <w:t xml:space="preserve"> </w:t>
+            </w:r>
+          </w:p>
+        </w:tc>
+        <w:tc>
+          <w:tcPr>
+            <w:tcW w:type="dxa" w:w="1900"/>
+            <w:tcBorders>
+              <w:top w:val="single" w:color="9A9A9A" w:sz="4"/>
+              <w:left w:val="single" w:color="9A9A9A" w:sz="4"/>
+              <w:bottom w:val="single" w:color="9A9A9A" w:sz="4"/>
+              <w:right w:val="single" w:color="9A9A9A" w:sz="4"/>
+            </w:tcBorders>
+            <w:tcMar>
+              <w:top w:type="dxa" w:w="70"/>
+              <w:left w:type="dxa" w:w="100"/>
+              <w:bottom w:type="dxa" w:w="70"/>
+              <w:right w:type="dxa" w:w="100"/>
+            </w:tcMar>
+            <w:vAlign w:val="top"/>
+          </w:tcPr>
+          <w:p>
+            <w:pPr>
+              <w:spacing w:after="0"/>
+            </w:pPr>
+            <w:r>
+              <w:rPr>
+                <w:rFonts w:ascii="Arial" w:cs="Arial" w:eastAsia="Arial" w:hAnsi="Arial"/>
+              </w:rPr>
+              <w:t xml:space="preserve"> </w:t>
+            </w:r>
+          </w:p>
+        </w:tc>
+        <w:tc>
+          <w:tcPr>
+            <w:tcW w:type="dxa" w:w="1400"/>
+            <w:tcBorders>
+              <w:top w:val="single" w:color="9A9A9A" w:sz="4"/>
+              <w:left w:val="single" w:color="9A9A9A" w:sz="4"/>
+              <w:bottom w:val="single" w:color="9A9A9A" w:sz="4"/>
+              <w:right w:val="single" w:color="9A9A9A" w:sz="4"/>
+            </w:tcBorders>
+            <w:tcMar>
+              <w:top w:type="dxa" w:w="70"/>
+              <w:left w:type="dxa" w:w="100"/>
+              <w:bottom w:type="dxa" w:w="70"/>
+              <w:right w:type="dxa" w:w="100"/>
+            </w:tcMar>
+            <w:vAlign w:val="top"/>
+          </w:tcPr>
+          <w:p>
+            <w:pPr>
+              <w:spacing w:after="0"/>
+            </w:pPr>
+            <w:r>
+              <w:rPr>
+                <w:rFonts w:ascii="Arial" w:cs="Arial" w:eastAsia="Arial" w:hAnsi="Arial"/>
+              </w:rPr>
+              <w:t xml:space="preserve"> </w:t>
+            </w:r>
+          </w:p>
+        </w:tc>
+        <w:tc>
+          <w:tcPr>
+            <w:tcW w:type="dxa" w:w="2580"/>
+            <w:tcBorders>
+              <w:top w:val="single" w:color="9A9A9A" w:sz="4"/>
+              <w:left w:val="single" w:color="9A9A9A" w:sz="4"/>
+              <w:bottom w:val="single" w:color="9A9A9A" w:sz="4"/>
+              <w:right w:val="single" w:color="9A9A9A" w:sz="4"/>
+            </w:tcBorders>
+            <w:tcMar>
+              <w:top w:type="dxa" w:w="70"/>
+              <w:left w:type="dxa" w:w="100"/>
+              <w:bottom w:type="dxa" w:w="70"/>
+              <w:right w:type="dxa" w:w="100"/>
+            </w:tcMar>
+            <w:vAlign w:val="top"/>
+          </w:tcPr>
+          <w:p>
+            <w:pPr>
+              <w:spacing w:after="0"/>
+            </w:pPr>
+            <w:r>
+              <w:rPr>
+                <w:rFonts w:ascii="Arial" w:cs="Arial" w:eastAsia="Arial" w:hAnsi="Arial"/>
+              </w:rPr>
+              <w:t xml:space="preserve"> </w:t>
+            </w:r>
+          </w:p>
+        </w:tc>
+      </w:tr>
+      <w:tr>
+        <w:trPr>
+          <w:cantSplit/>
+          <w:tblHeader w:val="false"/>
+          <w:trHeight w:val="700" w:hRule="atLeast"/>
+        </w:trPr>
+        <w:tc>
+          <w:tcPr>
+            <w:tcW w:type="dxa" w:w="1900"/>
+            <w:tcBorders>
+              <w:top w:val="single" w:color="9A9A9A" w:sz="4"/>
+              <w:left w:val="single" w:color="9A9A9A" w:sz="4"/>
+              <w:bottom w:val="single" w:color="9A9A9A" w:sz="4"/>
+              <w:right w:val="single" w:color="9A9A9A" w:sz="4"/>
+            </w:tcBorders>
+            <w:shd w:fill="F3EFE3" w:color="auto" w:val="clear"/>
+            <w:tcMar>
+              <w:top w:type="dxa" w:w="70"/>
+              <w:left w:type="dxa" w:w="100"/>
+              <w:bottom w:type="dxa" w:w="70"/>
+              <w:right w:type="dxa" w:w="100"/>
+            </w:tcMar>
+            <w:vAlign w:val="top"/>
+          </w:tcPr>
+          <w:p>
+            <w:pPr>
+              <w:spacing w:after="40"/>
+            </w:pPr>
+            <w:r>
+              <w:rPr>
+                <w:rFonts w:ascii="Arial" w:cs="Arial" w:eastAsia="Arial" w:hAnsi="Arial"/>
+                <w:b/>
+                <w:bCs/>
+                <w:sz w:val="17"/>
+                <w:szCs w:val="17"/>
+              </w:rPr>
+              <w:t xml:space="preserve">Large central vacuole</w:t>
+            </w:r>
+          </w:p>
+        </w:tc>
+        <w:tc>
+          <w:tcPr>
+            <w:tcW w:type="dxa" w:w="2300"/>
+            <w:tcBorders>
+              <w:top w:val="single" w:color="9A9A9A" w:sz="4"/>
+              <w:left w:val="single" w:color="9A9A9A" w:sz="4"/>
+              <w:bottom w:val="single" w:color="9A9A9A" w:sz="4"/>
+              <w:right w:val="single" w:color="9A9A9A" w:sz="4"/>
+            </w:tcBorders>
+            <w:tcMar>
+              <w:top w:type="dxa" w:w="70"/>
+              <w:left w:type="dxa" w:w="100"/>
+              <w:bottom w:type="dxa" w:w="70"/>
+              <w:right w:type="dxa" w:w="100"/>
+            </w:tcMar>
+            <w:vAlign w:val="top"/>
+          </w:tcPr>
+          <w:p>
+            <w:pPr>
+              <w:spacing w:after="0"/>
+            </w:pPr>
+            <w:r>
+              <w:rPr>
+                <w:rFonts w:ascii="Arial" w:cs="Arial" w:eastAsia="Arial" w:hAnsi="Arial"/>
+              </w:rPr>
+              <w:t xml:space="preserve"> </w:t>
+            </w:r>
+          </w:p>
+        </w:tc>
+        <w:tc>
+          <w:tcPr>
+            <w:tcW w:type="dxa" w:w="1900"/>
+            <w:tcBorders>
+              <w:top w:val="single" w:color="9A9A9A" w:sz="4"/>
+              <w:left w:val="single" w:color="9A9A9A" w:sz="4"/>
+              <w:bottom w:val="single" w:color="9A9A9A" w:sz="4"/>
+              <w:right w:val="single" w:color="9A9A9A" w:sz="4"/>
+            </w:tcBorders>
+            <w:tcMar>
+              <w:top w:type="dxa" w:w="70"/>
+              <w:left w:type="dxa" w:w="100"/>
+              <w:bottom w:type="dxa" w:w="70"/>
+              <w:right w:type="dxa" w:w="100"/>
+            </w:tcMar>
+            <w:vAlign w:val="top"/>
+          </w:tcPr>
+          <w:p>
+            <w:pPr>
+              <w:spacing w:after="0"/>
+            </w:pPr>
+            <w:r>
+              <w:rPr>
+                <w:rFonts w:ascii="Arial" w:cs="Arial" w:eastAsia="Arial" w:hAnsi="Arial"/>
+              </w:rPr>
+              <w:t xml:space="preserve"> </w:t>
+            </w:r>
+          </w:p>
+        </w:tc>
+        <w:tc>
+          <w:tcPr>
+            <w:tcW w:type="dxa" w:w="1400"/>
+            <w:tcBorders>
+              <w:top w:val="single" w:color="9A9A9A" w:sz="4"/>
+              <w:left w:val="single" w:color="9A9A9A" w:sz="4"/>
+              <w:bottom w:val="single" w:color="9A9A9A" w:sz="4"/>
+              <w:right w:val="single" w:color="9A9A9A" w:sz="4"/>
+            </w:tcBorders>
+            <w:tcMar>
+              <w:top w:type="dxa" w:w="70"/>
+              <w:left w:type="dxa" w:w="100"/>
+              <w:bottom w:type="dxa" w:w="70"/>
+              <w:right w:type="dxa" w:w="100"/>
+            </w:tcMar>
+            <w:vAlign w:val="top"/>
+          </w:tcPr>
+          <w:p>
+            <w:pPr>
+              <w:spacing w:after="0"/>
+            </w:pPr>
+            <w:r>
+              <w:rPr>
+                <w:rFonts w:ascii="Arial" w:cs="Arial" w:eastAsia="Arial" w:hAnsi="Arial"/>
+              </w:rPr>
+              <w:t xml:space="preserve"> </w:t>
+            </w:r>
+          </w:p>
+        </w:tc>
+        <w:tc>
+          <w:tcPr>
+            <w:tcW w:type="dxa" w:w="2580"/>
+            <w:tcBorders>
+              <w:top w:val="single" w:color="9A9A9A" w:sz="4"/>
+              <w:left w:val="single" w:color="9A9A9A" w:sz="4"/>
+              <w:bottom w:val="single" w:color="9A9A9A" w:sz="4"/>
+              <w:right w:val="single" w:color="9A9A9A" w:sz="4"/>
+            </w:tcBorders>
+            <w:tcMar>
+              <w:top w:type="dxa" w:w="70"/>
+              <w:left w:type="dxa" w:w="100"/>
+              <w:bottom w:type="dxa" w:w="70"/>
+              <w:right w:type="dxa" w:w="100"/>
+            </w:tcMar>
+            <w:vAlign w:val="top"/>
+          </w:tcPr>
+          <w:p>
+            <w:pPr>
+              <w:spacing w:after="0"/>
+            </w:pPr>
+            <w:r>
+              <w:rPr>
+                <w:rFonts w:ascii="Arial" w:cs="Arial" w:eastAsia="Arial" w:hAnsi="Arial"/>
+              </w:rPr>
+              <w:t xml:space="preserve"> </w:t>
+            </w:r>
+          </w:p>
+        </w:tc>
+      </w:tr>
+      <w:tr>
+        <w:trPr>
+          <w:cantSplit/>
+          <w:tblHeader w:val="false"/>
+          <w:trHeight w:val="700" w:hRule="atLeast"/>
+        </w:trPr>
+        <w:tc>
+          <w:tcPr>
+            <w:tcW w:type="dxa" w:w="1900"/>
+            <w:tcBorders>
+              <w:top w:val="single" w:color="9A9A9A" w:sz="4"/>
+              <w:left w:val="single" w:color="9A9A9A" w:sz="4"/>
+              <w:bottom w:val="single" w:color="9A9A9A" w:sz="4"/>
+              <w:right w:val="single" w:color="9A9A9A" w:sz="4"/>
+            </w:tcBorders>
+            <w:shd w:fill="F3EFE3" w:color="auto" w:val="clear"/>
+            <w:tcMar>
+              <w:top w:type="dxa" w:w="70"/>
+              <w:left w:type="dxa" w:w="100"/>
+              <w:bottom w:type="dxa" w:w="70"/>
+              <w:right w:type="dxa" w:w="100"/>
+            </w:tcMar>
+            <w:vAlign w:val="top"/>
+          </w:tcPr>
+          <w:p>
+            <w:pPr>
+              <w:spacing w:after="40"/>
+            </w:pPr>
+            <w:r>
+              <w:rPr>
+                <w:rFonts w:ascii="Arial" w:cs="Arial" w:eastAsia="Arial" w:hAnsi="Arial"/>
+                <w:b/>
+                <w:bCs/>
+                <w:sz w:val="17"/>
+                <w:szCs w:val="17"/>
+              </w:rPr>
+              <w:t xml:space="preserve">Ribosome</w:t>
+            </w:r>
+          </w:p>
+        </w:tc>
+        <w:tc>
+          <w:tcPr>
+            <w:tcW w:type="dxa" w:w="2300"/>
+            <w:tcBorders>
+              <w:top w:val="single" w:color="9A9A9A" w:sz="4"/>
+              <w:left w:val="single" w:color="9A9A9A" w:sz="4"/>
+              <w:bottom w:val="single" w:color="9A9A9A" w:sz="4"/>
+              <w:right w:val="single" w:color="9A9A9A" w:sz="4"/>
+            </w:tcBorders>
+            <w:tcMar>
+              <w:top w:type="dxa" w:w="70"/>
+              <w:left w:type="dxa" w:w="100"/>
+              <w:bottom w:type="dxa" w:w="70"/>
+              <w:right w:type="dxa" w:w="100"/>
+            </w:tcMar>
+            <w:vAlign w:val="top"/>
+          </w:tcPr>
+          <w:p>
+            <w:pPr>
+              <w:spacing w:after="0"/>
+            </w:pPr>
+            <w:r>
+              <w:rPr>
+                <w:rFonts w:ascii="Arial" w:cs="Arial" w:eastAsia="Arial" w:hAnsi="Arial"/>
+              </w:rPr>
+              <w:t xml:space="preserve"> </w:t>
+            </w:r>
+          </w:p>
+        </w:tc>
+        <w:tc>
+          <w:tcPr>
+            <w:tcW w:type="dxa" w:w="1900"/>
+            <w:tcBorders>
+              <w:top w:val="single" w:color="9A9A9A" w:sz="4"/>
+              <w:left w:val="single" w:color="9A9A9A" w:sz="4"/>
+              <w:bottom w:val="single" w:color="9A9A9A" w:sz="4"/>
+              <w:right w:val="single" w:color="9A9A9A" w:sz="4"/>
+            </w:tcBorders>
+            <w:tcMar>
+              <w:top w:type="dxa" w:w="70"/>
+              <w:left w:type="dxa" w:w="100"/>
+              <w:bottom w:type="dxa" w:w="70"/>
+              <w:right w:type="dxa" w:w="100"/>
+            </w:tcMar>
+            <w:vAlign w:val="top"/>
+          </w:tcPr>
+          <w:p>
+            <w:pPr>
+              <w:spacing w:after="0"/>
+            </w:pPr>
+            <w:r>
+              <w:rPr>
+                <w:rFonts w:ascii="Arial" w:cs="Arial" w:eastAsia="Arial" w:hAnsi="Arial"/>
+              </w:rPr>
+              <w:t xml:space="preserve"> </w:t>
+            </w:r>
+          </w:p>
+        </w:tc>
+        <w:tc>
+          <w:tcPr>
+            <w:tcW w:type="dxa" w:w="1400"/>
+            <w:tcBorders>
+              <w:top w:val="single" w:color="9A9A9A" w:sz="4"/>
+              <w:left w:val="single" w:color="9A9A9A" w:sz="4"/>
+              <w:bottom w:val="single" w:color="9A9A9A" w:sz="4"/>
+              <w:right w:val="single" w:color="9A9A9A" w:sz="4"/>
+            </w:tcBorders>
+            <w:tcMar>
+              <w:top w:type="dxa" w:w="70"/>
+              <w:left w:type="dxa" w:w="100"/>
+              <w:bottom w:type="dxa" w:w="70"/>
+              <w:right w:type="dxa" w:w="100"/>
+            </w:tcMar>
+            <w:vAlign w:val="top"/>
+          </w:tcPr>
+          <w:p>
+            <w:pPr>
+              <w:spacing w:after="0"/>
+            </w:pPr>
+            <w:r>
+              <w:rPr>
+                <w:rFonts w:ascii="Arial" w:cs="Arial" w:eastAsia="Arial" w:hAnsi="Arial"/>
+              </w:rPr>
+              <w:t xml:space="preserve"> </w:t>
+            </w:r>
+          </w:p>
+        </w:tc>
+        <w:tc>
+          <w:tcPr>
+            <w:tcW w:type="dxa" w:w="2580"/>
+            <w:tcBorders>
+              <w:top w:val="single" w:color="9A9A9A" w:sz="4"/>
+              <w:left w:val="single" w:color="9A9A9A" w:sz="4"/>
+              <w:bottom w:val="single" w:color="9A9A9A" w:sz="4"/>
+              <w:right w:val="single" w:color="9A9A9A" w:sz="4"/>
+            </w:tcBorders>
+            <w:tcMar>
+              <w:top w:type="dxa" w:w="70"/>
+              <w:left w:type="dxa" w:w="100"/>
+              <w:bottom w:type="dxa" w:w="70"/>
+              <w:right w:type="dxa" w:w="100"/>
+            </w:tcMar>
+            <w:vAlign w:val="top"/>
+          </w:tcPr>
+          <w:p>
+            <w:pPr>
+              <w:spacing w:after="0"/>
+            </w:pPr>
+            <w:r>
+              <w:rPr>
+                <w:rFonts w:ascii="Arial" w:cs="Arial" w:eastAsia="Arial" w:hAnsi="Arial"/>
+              </w:rPr>
+              <w:t xml:space="preserve"> </w:t>
+            </w:r>
+          </w:p>
+        </w:tc>
+      </w:tr>
+      <w:tr>
+        <w:trPr>
+          <w:cantSplit/>
+          <w:tblHeader w:val="false"/>
+          <w:trHeight w:val="700" w:hRule="atLeast"/>
+        </w:trPr>
+        <w:tc>
+          <w:tcPr>
+            <w:tcW w:type="dxa" w:w="1900"/>
+            <w:tcBorders>
+              <w:top w:val="single" w:color="9A9A9A" w:sz="4"/>
+              <w:left w:val="single" w:color="9A9A9A" w:sz="4"/>
+              <w:bottom w:val="single" w:color="9A9A9A" w:sz="4"/>
+              <w:right w:val="single" w:color="9A9A9A" w:sz="4"/>
+            </w:tcBorders>
+            <w:shd w:fill="F3EFE3" w:color="auto" w:val="clear"/>
+            <w:tcMar>
+              <w:top w:type="dxa" w:w="70"/>
+              <w:left w:type="dxa" w:w="100"/>
+              <w:bottom w:type="dxa" w:w="70"/>
+              <w:right w:type="dxa" w:w="100"/>
+            </w:tcMar>
+            <w:vAlign w:val="top"/>
+          </w:tcPr>
+          <w:p>
+            <w:pPr>
+              <w:spacing w:after="40"/>
+            </w:pPr>
+            <w:r>
+              <w:rPr>
+                <w:rFonts w:ascii="Arial" w:cs="Arial" w:eastAsia="Arial" w:hAnsi="Arial"/>
+                <w:b/>
+                <w:bCs/>
+                <w:sz w:val="17"/>
+                <w:szCs w:val="17"/>
+              </w:rPr>
+              <w:t xml:space="preserve">Endoplasmic reticulum (ER)</w:t>
+            </w:r>
+          </w:p>
+        </w:tc>
+        <w:tc>
+          <w:tcPr>
+            <w:tcW w:type="dxa" w:w="2300"/>
+            <w:tcBorders>
+              <w:top w:val="single" w:color="9A9A9A" w:sz="4"/>
+              <w:left w:val="single" w:color="9A9A9A" w:sz="4"/>
+              <w:bottom w:val="single" w:color="9A9A9A" w:sz="4"/>
+              <w:right w:val="single" w:color="9A9A9A" w:sz="4"/>
+            </w:tcBorders>
+            <w:tcMar>
+              <w:top w:type="dxa" w:w="70"/>
+              <w:left w:type="dxa" w:w="100"/>
+              <w:bottom w:type="dxa" w:w="70"/>
+              <w:right w:type="dxa" w:w="100"/>
+            </w:tcMar>
+            <w:vAlign w:val="top"/>
+          </w:tcPr>
+          <w:p>
+            <w:pPr>
+              <w:spacing w:after="0"/>
+            </w:pPr>
+            <w:r>
+              <w:rPr>
+                <w:rFonts w:ascii="Arial" w:cs="Arial" w:eastAsia="Arial" w:hAnsi="Arial"/>
+              </w:rPr>
+              <w:t xml:space="preserve"> </w:t>
+            </w:r>
+          </w:p>
+        </w:tc>
+        <w:tc>
+          <w:tcPr>
+            <w:tcW w:type="dxa" w:w="1900"/>
+            <w:tcBorders>
+              <w:top w:val="single" w:color="9A9A9A" w:sz="4"/>
+              <w:left w:val="single" w:color="9A9A9A" w:sz="4"/>
+              <w:bottom w:val="single" w:color="9A9A9A" w:sz="4"/>
+              <w:right w:val="single" w:color="9A9A9A" w:sz="4"/>
+            </w:tcBorders>
+            <w:tcMar>
+              <w:top w:type="dxa" w:w="70"/>
+              <w:left w:type="dxa" w:w="100"/>
+              <w:bottom w:type="dxa" w:w="70"/>
+              <w:right w:type="dxa" w:w="100"/>
+            </w:tcMar>
+            <w:vAlign w:val="top"/>
+          </w:tcPr>
+          <w:p>
+            <w:pPr>
+              <w:spacing w:after="0"/>
+            </w:pPr>
+            <w:r>
+              <w:rPr>
+                <w:rFonts w:ascii="Arial" w:cs="Arial" w:eastAsia="Arial" w:hAnsi="Arial"/>
+              </w:rPr>
+              <w:t xml:space="preserve"> </w:t>
+            </w:r>
+          </w:p>
+        </w:tc>
+        <w:tc>
+          <w:tcPr>
+            <w:tcW w:type="dxa" w:w="1400"/>
+            <w:tcBorders>
+              <w:top w:val="single" w:color="9A9A9A" w:sz="4"/>
+              <w:left w:val="single" w:color="9A9A9A" w:sz="4"/>
+              <w:bottom w:val="single" w:color="9A9A9A" w:sz="4"/>
+              <w:right w:val="single" w:color="9A9A9A" w:sz="4"/>
+            </w:tcBorders>
+            <w:tcMar>
+              <w:top w:type="dxa" w:w="70"/>
+              <w:left w:type="dxa" w:w="100"/>
+              <w:bottom w:type="dxa" w:w="70"/>
+              <w:right w:type="dxa" w:w="100"/>
+            </w:tcMar>
+            <w:vAlign w:val="top"/>
+          </w:tcPr>
+          <w:p>
+            <w:pPr>
+              <w:spacing w:after="0"/>
+            </w:pPr>
+            <w:r>
+              <w:rPr>
+                <w:rFonts w:ascii="Arial" w:cs="Arial" w:eastAsia="Arial" w:hAnsi="Arial"/>
+              </w:rPr>
+              <w:t xml:space="preserve"> </w:t>
+            </w:r>
+          </w:p>
+        </w:tc>
+        <w:tc>
+          <w:tcPr>
+            <w:tcW w:type="dxa" w:w="2580"/>
+            <w:tcBorders>
+              <w:top w:val="single" w:color="9A9A9A" w:sz="4"/>
+              <w:left w:val="single" w:color="9A9A9A" w:sz="4"/>
+              <w:bottom w:val="single" w:color="9A9A9A" w:sz="4"/>
+              <w:right w:val="single" w:color="9A9A9A" w:sz="4"/>
+            </w:tcBorders>
+            <w:tcMar>
+              <w:top w:type="dxa" w:w="70"/>
+              <w:left w:type="dxa" w:w="100"/>
+              <w:bottom w:type="dxa" w:w="70"/>
+              <w:right w:type="dxa" w:w="100"/>
+            </w:tcMar>
+            <w:vAlign w:val="top"/>
+          </w:tcPr>
+          <w:p>
+            <w:pPr>
+              <w:spacing w:after="0"/>
+            </w:pPr>
+            <w:r>
+              <w:rPr>
+                <w:rFonts w:ascii="Arial" w:cs="Arial" w:eastAsia="Arial" w:hAnsi="Arial"/>
+              </w:rPr>
+              <w:t xml:space="preserve"> </w:t>
+            </w:r>
+          </w:p>
+        </w:tc>
+      </w:tr>
+      <w:tr>
+        <w:trPr>
+          <w:cantSplit/>
+          <w:tblHeader w:val="false"/>
+          <w:trHeight w:val="700" w:hRule="atLeast"/>
+        </w:trPr>
+        <w:tc>
+          <w:tcPr>
+            <w:tcW w:type="dxa" w:w="1900"/>
+            <w:tcBorders>
+              <w:top w:val="single" w:color="9A9A9A" w:sz="4"/>
+              <w:left w:val="single" w:color="9A9A9A" w:sz="4"/>
+              <w:bottom w:val="single" w:color="9A9A9A" w:sz="4"/>
+              <w:right w:val="single" w:color="9A9A9A" w:sz="4"/>
+            </w:tcBorders>
+            <w:shd w:fill="F3EFE3" w:color="auto" w:val="clear"/>
+            <w:tcMar>
+              <w:top w:type="dxa" w:w="70"/>
+              <w:left w:type="dxa" w:w="100"/>
+              <w:bottom w:type="dxa" w:w="70"/>
+              <w:right w:type="dxa" w:w="100"/>
+            </w:tcMar>
+            <w:vAlign w:val="top"/>
+          </w:tcPr>
+          <w:p>
+            <w:pPr>
+              <w:spacing w:after="40"/>
+            </w:pPr>
+            <w:r>
+              <w:rPr>
+                <w:rFonts w:ascii="Arial" w:cs="Arial" w:eastAsia="Arial" w:hAnsi="Arial"/>
+                <w:b/>
+                <w:bCs/>
+                <w:sz w:val="17"/>
+                <w:szCs w:val="17"/>
+              </w:rPr>
+              <w:t xml:space="preserve">Golgi apparatus</w:t>
+            </w:r>
+          </w:p>
+        </w:tc>
+        <w:tc>
+          <w:tcPr>
+            <w:tcW w:type="dxa" w:w="2300"/>
+            <w:tcBorders>
+              <w:top w:val="single" w:color="9A9A9A" w:sz="4"/>
+              <w:left w:val="single" w:color="9A9A9A" w:sz="4"/>
+              <w:bottom w:val="single" w:color="9A9A9A" w:sz="4"/>
+              <w:right w:val="single" w:color="9A9A9A" w:sz="4"/>
+            </w:tcBorders>
+            <w:tcMar>
+              <w:top w:type="dxa" w:w="70"/>
+              <w:left w:type="dxa" w:w="100"/>
+              <w:bottom w:type="dxa" w:w="70"/>
+              <w:right w:type="dxa" w:w="100"/>
+            </w:tcMar>
+            <w:vAlign w:val="top"/>
+          </w:tcPr>
+          <w:p>
+            <w:pPr>
+              <w:spacing w:after="0"/>
+            </w:pPr>
+            <w:r>
+              <w:rPr>
+                <w:rFonts w:ascii="Arial" w:cs="Arial" w:eastAsia="Arial" w:hAnsi="Arial"/>
+              </w:rPr>
+              <w:t xml:space="preserve"> </w:t>
+            </w:r>
+          </w:p>
+        </w:tc>
+        <w:tc>
+          <w:tcPr>
+            <w:tcW w:type="dxa" w:w="1900"/>
+            <w:tcBorders>
+              <w:top w:val="single" w:color="9A9A9A" w:sz="4"/>
+              <w:left w:val="single" w:color="9A9A9A" w:sz="4"/>
+              <w:bottom w:val="single" w:color="9A9A9A" w:sz="4"/>
+              <w:right w:val="single" w:color="9A9A9A" w:sz="4"/>
+            </w:tcBorders>
+            <w:tcMar>
+              <w:top w:type="dxa" w:w="70"/>
+              <w:left w:type="dxa" w:w="100"/>
+              <w:bottom w:type="dxa" w:w="70"/>
+              <w:right w:type="dxa" w:w="100"/>
+            </w:tcMar>
+            <w:vAlign w:val="top"/>
+          </w:tcPr>
+          <w:p>
+            <w:pPr>
+              <w:spacing w:after="0"/>
+            </w:pPr>
+            <w:r>
+              <w:rPr>
+                <w:rFonts w:ascii="Arial" w:cs="Arial" w:eastAsia="Arial" w:hAnsi="Arial"/>
+              </w:rPr>
+              <w:t xml:space="preserve"> </w:t>
+            </w:r>
+          </w:p>
+        </w:tc>
+        <w:tc>
+          <w:tcPr>
+            <w:tcW w:type="dxa" w:w="1400"/>
+            <w:tcBorders>
+              <w:top w:val="single" w:color="9A9A9A" w:sz="4"/>
+              <w:left w:val="single" w:color="9A9A9A" w:sz="4"/>
+              <w:bottom w:val="single" w:color="9A9A9A" w:sz="4"/>
+              <w:right w:val="single" w:color="9A9A9A" w:sz="4"/>
+            </w:tcBorders>
+            <w:tcMar>
+              <w:top w:type="dxa" w:w="70"/>
+              <w:left w:type="dxa" w:w="100"/>
+              <w:bottom w:type="dxa" w:w="70"/>
+              <w:right w:type="dxa" w:w="100"/>
+            </w:tcMar>
+            <w:vAlign w:val="top"/>
+          </w:tcPr>
+          <w:p>
+            <w:pPr>
+              <w:spacing w:after="0"/>
+            </w:pPr>
+            <w:r>
+              <w:rPr>
+                <w:rFonts w:ascii="Arial" w:cs="Arial" w:eastAsia="Arial" w:hAnsi="Arial"/>
+              </w:rPr>
+              <w:t xml:space="preserve"> </w:t>
+            </w:r>
+          </w:p>
+        </w:tc>
+        <w:tc>
+          <w:tcPr>
+            <w:tcW w:type="dxa" w:w="2580"/>
+            <w:tcBorders>
+              <w:top w:val="single" w:color="9A9A9A" w:sz="4"/>
+              <w:left w:val="single" w:color="9A9A9A" w:sz="4"/>
+              <w:bottom w:val="single" w:color="9A9A9A" w:sz="4"/>
+              <w:right w:val="single" w:color="9A9A9A" w:sz="4"/>
+            </w:tcBorders>
+            <w:tcMar>
+              <w:top w:type="dxa" w:w="70"/>
+              <w:left w:type="dxa" w:w="100"/>
+              <w:bottom w:type="dxa" w:w="70"/>
+              <w:right w:type="dxa" w:w="100"/>
+            </w:tcMar>
+            <w:vAlign w:val="top"/>
+          </w:tcPr>
+          <w:p>
+            <w:pPr>
+              <w:spacing w:after="0"/>
+            </w:pPr>
+            <w:r>
+              <w:rPr>
+                <w:rFonts w:ascii="Arial" w:cs="Arial" w:eastAsia="Arial" w:hAnsi="Arial"/>
+              </w:rPr>
+              <w:t xml:space="preserve"> </w:t>
+            </w:r>
+          </w:p>
+        </w:tc>
+      </w:tr>
+      <w:tr>
+        <w:trPr>
+          <w:cantSplit/>
+          <w:tblHeader w:val="false"/>
+          <w:trHeight w:val="700" w:hRule="atLeast"/>
+        </w:trPr>
+        <w:tc>
+          <w:tcPr>
+            <w:tcW w:type="dxa" w:w="1900"/>
+            <w:tcBorders>
+              <w:top w:val="single" w:color="9A9A9A" w:sz="4"/>
+              <w:left w:val="single" w:color="9A9A9A" w:sz="4"/>
+              <w:bottom w:val="single" w:color="9A9A9A" w:sz="4"/>
+              <w:right w:val="single" w:color="9A9A9A" w:sz="4"/>
+            </w:tcBorders>
+            <w:shd w:fill="F3EFE3" w:color="auto" w:val="clear"/>
+            <w:tcMar>
+              <w:top w:type="dxa" w:w="70"/>
+              <w:left w:type="dxa" w:w="100"/>
+              <w:bottom w:type="dxa" w:w="70"/>
+              <w:right w:type="dxa" w:w="100"/>
+            </w:tcMar>
+            <w:vAlign w:val="top"/>
+          </w:tcPr>
+          <w:p>
+            <w:pPr>
+              <w:spacing w:after="40"/>
+            </w:pPr>
+            <w:r>
+              <w:rPr>
+                <w:rFonts w:ascii="Arial" w:cs="Arial" w:eastAsia="Arial" w:hAnsi="Arial"/>
+                <w:b/>
+                <w:bCs/>
+                <w:sz w:val="17"/>
+                <w:szCs w:val="17"/>
+              </w:rPr>
+              <w:t xml:space="preserve">Lysosome</w:t>
+            </w:r>
+          </w:p>
+        </w:tc>
+        <w:tc>
+          <w:tcPr>
+            <w:tcW w:type="dxa" w:w="2300"/>
+            <w:tcBorders>
+              <w:top w:val="single" w:color="9A9A9A" w:sz="4"/>
+              <w:left w:val="single" w:color="9A9A9A" w:sz="4"/>
+              <w:bottom w:val="single" w:color="9A9A9A" w:sz="4"/>
+              <w:right w:val="single" w:color="9A9A9A" w:sz="4"/>
+            </w:tcBorders>
+            <w:tcMar>
+              <w:top w:type="dxa" w:w="70"/>
+              <w:left w:type="dxa" w:w="100"/>
+              <w:bottom w:type="dxa" w:w="70"/>
+              <w:right w:type="dxa" w:w="100"/>
+            </w:tcMar>
+            <w:vAlign w:val="top"/>
+          </w:tcPr>
+          <w:p>
+            <w:pPr>
+              <w:spacing w:after="0"/>
+            </w:pPr>
+            <w:r>
+              <w:rPr>
+                <w:rFonts w:ascii="Arial" w:cs="Arial" w:eastAsia="Arial" w:hAnsi="Arial"/>
+              </w:rPr>
+              <w:t xml:space="preserve"> </w:t>
+            </w:r>
+          </w:p>
+        </w:tc>
+        <w:tc>
+          <w:tcPr>
+            <w:tcW w:type="dxa" w:w="1900"/>
+            <w:tcBorders>
+              <w:top w:val="single" w:color="9A9A9A" w:sz="4"/>
+              <w:left w:val="single" w:color="9A9A9A" w:sz="4"/>
+              <w:bottom w:val="single" w:color="9A9A9A" w:sz="4"/>
+              <w:right w:val="single" w:color="9A9A9A" w:sz="4"/>
+            </w:tcBorders>
+            <w:tcMar>
+              <w:top w:type="dxa" w:w="70"/>
+              <w:left w:type="dxa" w:w="100"/>
+              <w:bottom w:type="dxa" w:w="70"/>
+              <w:right w:type="dxa" w:w="100"/>
+            </w:tcMar>
+            <w:vAlign w:val="top"/>
+          </w:tcPr>
+          <w:p>
+            <w:pPr>
+              <w:spacing w:after="0"/>
+            </w:pPr>
+            <w:r>
+              <w:rPr>
+                <w:rFonts w:ascii="Arial" w:cs="Arial" w:eastAsia="Arial" w:hAnsi="Arial"/>
+              </w:rPr>
+              <w:t xml:space="preserve"> </w:t>
+            </w:r>
+          </w:p>
+        </w:tc>
+        <w:tc>
+          <w:tcPr>
+            <w:tcW w:type="dxa" w:w="1400"/>
+            <w:tcBorders>
+              <w:top w:val="single" w:color="9A9A9A" w:sz="4"/>
+              <w:left w:val="single" w:color="9A9A9A" w:sz="4"/>
+              <w:bottom w:val="single" w:color="9A9A9A" w:sz="4"/>
+              <w:right w:val="single" w:color="9A9A9A" w:sz="4"/>
+            </w:tcBorders>
+            <w:tcMar>
+              <w:top w:type="dxa" w:w="70"/>
+              <w:left w:type="dxa" w:w="100"/>
+              <w:bottom w:type="dxa" w:w="70"/>
+              <w:right w:type="dxa" w:w="100"/>
+            </w:tcMar>
+            <w:vAlign w:val="top"/>
+          </w:tcPr>
+          <w:p>
+            <w:pPr>
+              <w:spacing w:after="0"/>
+            </w:pPr>
+            <w:r>
+              <w:rPr>
+                <w:rFonts w:ascii="Arial" w:cs="Arial" w:eastAsia="Arial" w:hAnsi="Arial"/>
+              </w:rPr>
+              <w:t xml:space="preserve"> </w:t>
+            </w:r>
+          </w:p>
+        </w:tc>
+        <w:tc>
+          <w:tcPr>
+            <w:tcW w:type="dxa" w:w="2580"/>
+            <w:tcBorders>
+              <w:top w:val="single" w:color="9A9A9A" w:sz="4"/>
+              <w:left w:val="single" w:color="9A9A9A" w:sz="4"/>
+              <w:bottom w:val="single" w:color="9A9A9A" w:sz="4"/>
+              <w:right w:val="single" w:color="9A9A9A" w:sz="4"/>
+            </w:tcBorders>
+            <w:tcMar>
+              <w:top w:type="dxa" w:w="70"/>
+              <w:left w:type="dxa" w:w="100"/>
+              <w:bottom w:type="dxa" w:w="70"/>
+              <w:right w:type="dxa" w:w="100"/>
+            </w:tcMar>
+            <w:vAlign w:val="top"/>
+          </w:tcPr>
+          <w:p>
+            <w:pPr>
+              <w:spacing w:after="0"/>
+            </w:pPr>
+            <w:r>
+              <w:rPr>
+                <w:rFonts w:ascii="Arial" w:cs="Arial" w:eastAsia="Arial" w:hAnsi="Arial"/>
+              </w:rPr>
+              <w:t xml:space="preserve"> </w:t>
+            </w:r>
+          </w:p>
+        </w:tc>
+      </w:tr>
+    </w:tbl>
+    <w:p>
+      <w:pPr>
+        <w:spacing w:after="80"/>
+      </w:pPr>
+    </w:p>
+    <w:p>
+      <w:pPr>
+        <w:keepNext/>
+        <w:spacing w:after="80" w:before="200"/>
+      </w:pPr>
+      <w:r>
+        <w:rPr>
+          <w:rFonts w:ascii="Arial" w:cs="Arial" w:eastAsia="Arial" w:hAnsi="Arial"/>
+          <w:b/>
+          <w:bCs/>
+        </w:rPr>
+        <w:t xml:space="preserve">3e.</w:t>
+      </w:r>
+      <w:r>
+        <w:rPr>
+          <w:rFonts w:ascii="Arial" w:cs="Arial" w:eastAsia="Arial" w:hAnsi="Arial"/>
+        </w:rPr>
+        <w:t xml:space="preserve"> </w:t>
+      </w:r>
+      <w:r>
+        <w:rPr>
+          <w:rFonts w:ascii="Arial" w:cs="Arial" w:eastAsia="Arial" w:hAnsi="Arial"/>
+          <w:b/>
+          <w:bCs/>
+        </w:rPr>
+        <w:t xml:space="preserve">Shape fits job.</w:t>
+      </w:r>
+      <w:r>
+        <w:rPr>
+          <w:rFonts w:ascii="Arial" w:cs="Arial" w:eastAsia="Arial" w:hAnsi="Arial"/>
+        </w:rPr>
+        <w:t xml:space="preserve"> Choose </w:t>
+      </w:r>
+      <w:r>
+        <w:rPr>
+          <w:rFonts w:ascii="Arial" w:cs="Arial" w:eastAsia="Arial" w:hAnsi="Arial"/>
+          <w:b/>
+          <w:bCs/>
+        </w:rPr>
+        <w:t xml:space="preserve">three</w:t>
+      </w:r>
+      <w:r>
+        <w:rPr>
+          <w:rFonts w:ascii="Arial" w:cs="Arial" w:eastAsia="Arial" w:hAnsi="Arial"/>
+        </w:rPr>
+        <w:t xml:space="preserve"> organelles from your table. For each one, explain how its </w:t>
+      </w:r>
+      <w:r>
+        <w:rPr>
+          <w:rFonts w:ascii="Arial" w:cs="Arial" w:eastAsia="Arial" w:hAnsi="Arial"/>
+          <w:b/>
+          <w:bCs/>
+        </w:rPr>
+        <w:t xml:space="preserve">shape</w:t>
+      </w:r>
+      <w:r>
+        <w:rPr>
+          <w:rFonts w:ascii="Arial" w:cs="Arial" w:eastAsia="Arial" w:hAnsi="Arial"/>
+        </w:rPr>
+        <w:t xml:space="preserve"> helps it do its job. (Example: a chloroplast is a flat disc, which gives a large surface to catch light.)</w:t>
+      </w:r>
+    </w:p>
+    <w:tbl>
+      <w:tblPr>
+        <w:tblW w:type="dxa" w:w="10080"/>
+        <w:tblBorders>
+          <w:top w:val="single" w:color="auto" w:sz="4"/>
+          <w:left w:val="single" w:color="auto" w:sz="4"/>
+          <w:bottom w:val="single" w:color="auto" w:sz="4"/>
+          <w:right w:val="single" w:color="auto" w:sz="4"/>
+          <w:insideH w:val="single" w:color="auto" w:sz="4"/>
+          <w:insideV w:val="single" w:color="auto" w:sz="4"/>
+        </w:tblBorders>
+        <w:tblLayout w:type="fixed"/>
+      </w:tblPr>
+      <w:tblGrid>
+        <w:gridCol w:w="10080"/>
+      </w:tblGrid>
+      <w:tr>
+        <w:trPr>
+          <w:cantSplit w:val="false"/>
+          <w:trHeight w:val="2400" w:hRule="atLeast"/>
+        </w:trPr>
+        <w:tc>
+          <w:tcPr>
+            <w:tcW w:type="dxa" w:w="10080"/>
+            <w:tcBorders>
+              <w:top w:val="single" w:color="9A9A9A" w:sz="4"/>
+              <w:left w:val="single" w:color="9A9A9A" w:sz="4"/>
+              <w:bottom w:val="single" w:color="9A9A9A" w:sz="4"/>
+              <w:right w:val="single" w:color="9A9A9A" w:sz="4"/>
+            </w:tcBorders>
+            <w:tcMar>
+              <w:top w:type="dxa" w:w="70"/>
+              <w:left w:type="dxa" w:w="100"/>
+              <w:bottom w:type="dxa" w:w="70"/>
+              <w:right w:type="dxa" w:w="100"/>
+            </w:tcMar>
+          </w:tcPr>
+          <w:p>
+            <w:pPr>
+              <w:spacing w:after="0"/>
+            </w:pPr>
+            <w:r>
+              <w:rPr>
+                <w:rFonts w:ascii="Arial" w:cs="Arial" w:eastAsia="Arial" w:hAnsi="Arial"/>
+              </w:rPr>
+              <w:t xml:space="preserve"> </w:t>
+            </w:r>
+          </w:p>
+        </w:tc>
+      </w:tr>
+    </w:tbl>
+    <w:p>
+      <w:pPr>
+        <w:keepNext/>
+        <w:spacing w:after="80" w:before="200"/>
+      </w:pPr>
+      <w:r>
+        <w:rPr>
+          <w:rFonts w:ascii="Arial" w:cs="Arial" w:eastAsia="Arial" w:hAnsi="Arial"/>
+          <w:b/>
+          <w:bCs/>
+        </w:rPr>
+        <w:t xml:space="preserve">3f.</w:t>
+      </w:r>
+      <w:r>
+        <w:rPr>
+          <w:rFonts w:ascii="Arial" w:cs="Arial" w:eastAsia="Arial" w:hAnsi="Arial"/>
+        </w:rPr>
+        <w:t xml:space="preserve"> </w:t>
+      </w:r>
+      <w:r>
+        <w:rPr>
+          <w:rFonts w:ascii="Arial" w:cs="Arial" w:eastAsia="Arial" w:hAnsi="Arial"/>
+          <w:b/>
+          <w:bCs/>
+        </w:rPr>
+        <w:t xml:space="preserve">Size and number.</w:t>
+      </w:r>
+      <w:r>
+        <w:rPr>
+          <w:rFonts w:ascii="Arial" w:cs="Arial" w:eastAsia="Arial" w:hAnsi="Arial"/>
+        </w:rPr>
+        <w:t xml:space="preserve"> Which organelle on your list is the </w:t>
+      </w:r>
+      <w:r>
+        <w:rPr>
+          <w:rFonts w:ascii="Arial" w:cs="Arial" w:eastAsia="Arial" w:hAnsi="Arial"/>
+          <w:b/>
+          <w:bCs/>
+        </w:rPr>
+        <w:t xml:space="preserve">smallest</w:t>
+      </w:r>
+      <w:r>
+        <w:rPr>
+          <w:rFonts w:ascii="Arial" w:cs="Arial" w:eastAsia="Arial" w:hAnsi="Arial"/>
+        </w:rPr>
+        <w:t xml:space="preserve">? Which is the </w:t>
+      </w:r>
+      <w:r>
+        <w:rPr>
+          <w:rFonts w:ascii="Arial" w:cs="Arial" w:eastAsia="Arial" w:hAnsi="Arial"/>
+          <w:b/>
+          <w:bCs/>
+        </w:rPr>
+        <w:t xml:space="preserve">largest</w:t>
+      </w:r>
+      <w:r>
+        <w:rPr>
+          <w:rFonts w:ascii="Arial" w:cs="Arial" w:eastAsia="Arial" w:hAnsi="Arial"/>
+        </w:rPr>
+        <w:t xml:space="preserve">? Ribosomes are found in huge numbers, but a cell usually has only one nucleus. Explain how each one's size and job could be related to how many the cell has.</w:t>
+      </w:r>
+    </w:p>
+    <w:tbl>
+      <w:tblPr>
+        <w:tblW w:type="dxa" w:w="10080"/>
+        <w:tblBorders>
+          <w:top w:val="single" w:color="auto" w:sz="4"/>
+          <w:left w:val="single" w:color="auto" w:sz="4"/>
+          <w:bottom w:val="single" w:color="auto" w:sz="4"/>
+          <w:right w:val="single" w:color="auto" w:sz="4"/>
+          <w:insideH w:val="single" w:color="auto" w:sz="4"/>
+          <w:insideV w:val="single" w:color="auto" w:sz="4"/>
+        </w:tblBorders>
+        <w:tblLayout w:type="fixed"/>
+      </w:tblPr>
+      <w:tblGrid>
+        <w:gridCol w:w="10080"/>
+      </w:tblGrid>
+      <w:tr>
+        <w:trPr>
+          <w:cantSplit w:val="false"/>
+          <w:trHeight w:val="2000" w:hRule="atLeast"/>
+        </w:trPr>
+        <w:tc>
+          <w:tcPr>
+            <w:tcW w:type="dxa" w:w="10080"/>
+            <w:tcBorders>
+              <w:top w:val="single" w:color="9A9A9A" w:sz="4"/>
+              <w:left w:val="single" w:color="9A9A9A" w:sz="4"/>
+              <w:bottom w:val="single" w:color="9A9A9A" w:sz="4"/>
+              <w:right w:val="single" w:color="9A9A9A" w:sz="4"/>
+            </w:tcBorders>
+            <w:tcMar>
+              <w:top w:type="dxa" w:w="70"/>
+              <w:left w:type="dxa" w:w="100"/>
+              <w:bottom w:type="dxa" w:w="70"/>
+              <w:right w:type="dxa" w:w="100"/>
+            </w:tcMar>
+          </w:tcPr>
+          <w:p>
+            <w:pPr>
+              <w:spacing w:after="0"/>
+            </w:pPr>
+            <w:r>
+              <w:rPr>
+                <w:rFonts w:ascii="Arial" w:cs="Arial" w:eastAsia="Arial" w:hAnsi="Arial"/>
+              </w:rPr>
+              <w:t xml:space="preserve"> </w:t>
+            </w:r>
+          </w:p>
+        </w:tc>
+      </w:tr>
+    </w:tbl>
+    <w:p>
+      <w:pPr>
+        <w:keepNext/>
+        <w:spacing w:after="80" w:before="200"/>
+      </w:pPr>
+      <w:r>
+        <w:rPr>
+          <w:rFonts w:ascii="Arial" w:cs="Arial" w:eastAsia="Arial" w:hAnsi="Arial"/>
+          <w:b/>
+          <w:bCs/>
+        </w:rPr>
+        <w:t xml:space="preserve">3g.</w:t>
+      </w:r>
+      <w:r>
+        <w:rPr>
+          <w:rFonts w:ascii="Arial" w:cs="Arial" w:eastAsia="Arial" w:hAnsi="Arial"/>
+        </w:rPr>
+        <w:t xml:space="preserve"> </w:t>
+      </w:r>
+      <w:r>
+        <w:rPr>
+          <w:rFonts w:ascii="Arial" w:cs="Arial" w:eastAsia="Arial" w:hAnsi="Arial"/>
+          <w:b/>
+          <w:bCs/>
+        </w:rPr>
+        <w:t xml:space="preserve">Plant vs. animal.</w:t>
+      </w:r>
+      <w:r>
+        <w:rPr>
+          <w:rFonts w:ascii="Arial" w:cs="Arial" w:eastAsia="Arial" w:hAnsi="Arial"/>
+        </w:rPr>
+        <w:t xml:space="preserve"> Which organelles are found only (or mostly) in plant cells? Which are mostly in animal cells? How do these differences change the </w:t>
+      </w:r>
+      <w:r>
+        <w:rPr>
+          <w:rFonts w:ascii="Arial" w:cs="Arial" w:eastAsia="Arial" w:hAnsi="Arial"/>
+          <w:b/>
+          <w:bCs/>
+        </w:rPr>
+        <w:t xml:space="preserve">size and shape</w:t>
+      </w:r>
+      <w:r>
+        <w:rPr>
+          <w:rFonts w:ascii="Arial" w:cs="Arial" w:eastAsia="Arial" w:hAnsi="Arial"/>
+        </w:rPr>
+        <w:t xml:space="preserve"> of a plant cell compared with an animal cell?</w:t>
+      </w:r>
+    </w:p>
+    <w:tbl>
+      <w:tblPr>
+        <w:tblW w:type="dxa" w:w="10080"/>
+        <w:tblBorders>
+          <w:top w:val="single" w:color="auto" w:sz="4"/>
+          <w:left w:val="single" w:color="auto" w:sz="4"/>
+          <w:bottom w:val="single" w:color="auto" w:sz="4"/>
+          <w:right w:val="single" w:color="auto" w:sz="4"/>
+          <w:insideH w:val="single" w:color="auto" w:sz="4"/>
+          <w:insideV w:val="single" w:color="auto" w:sz="4"/>
+        </w:tblBorders>
+        <w:tblLayout w:type="fixed"/>
+      </w:tblPr>
+      <w:tblGrid>
+        <w:gridCol w:w="10080"/>
+      </w:tblGrid>
+      <w:tr>
+        <w:trPr>
+          <w:cantSplit w:val="false"/>
+          <w:trHeight w:val="2000" w:hRule="atLeast"/>
+        </w:trPr>
+        <w:tc>
+          <w:tcPr>
+            <w:tcW w:type="dxa" w:w="10080"/>
+            <w:tcBorders>
+              <w:top w:val="single" w:color="9A9A9A" w:sz="4"/>
+              <w:left w:val="single" w:color="9A9A9A" w:sz="4"/>
+              <w:bottom w:val="single" w:color="9A9A9A" w:sz="4"/>
+              <w:right w:val="single" w:color="9A9A9A" w:sz="4"/>
+            </w:tcBorders>
+            <w:tcMar>
+              <w:top w:type="dxa" w:w="70"/>
+              <w:left w:type="dxa" w:w="100"/>
+              <w:bottom w:type="dxa" w:w="70"/>
+              <w:right w:type="dxa" w:w="100"/>
+            </w:tcMar>
+          </w:tcPr>
+          <w:p>
+            <w:pPr>
+              <w:spacing w:after="0"/>
+            </w:pPr>
+            <w:r>
+              <w:rPr>
+                <w:rFonts w:ascii="Arial" w:cs="Arial" w:eastAsia="Arial" w:hAnsi="Arial"/>
+              </w:rPr>
+              <w:t xml:space="preserve"> </w:t>
+            </w:r>
+          </w:p>
+        </w:tc>
+      </w:tr>
+    </w:tbl>
+    <w:p>
+      <w:pPr>
         <w:pStyle w:val="Heading1"/>
         <w:keepNext/>
       </w:pPr>
@@ -4064,6 +6424,613 @@
         <w:trPr>
           <w:cantSplit w:val="false"/>
           <w:trHeight w:val="1500" w:hRule="atLeast"/>
+        </w:trPr>
+        <w:tc>
+          <w:tcPr>
+            <w:tcW w:type="dxa" w:w="10080"/>
+            <w:tcBorders>
+              <w:top w:val="single" w:color="9A9A9A" w:sz="4"/>
+              <w:left w:val="single" w:color="9A9A9A" w:sz="4"/>
+              <w:bottom w:val="single" w:color="9A9A9A" w:sz="4"/>
+              <w:right w:val="single" w:color="9A9A9A" w:sz="4"/>
+            </w:tcBorders>
+            <w:tcMar>
+              <w:top w:type="dxa" w:w="70"/>
+              <w:left w:type="dxa" w:w="100"/>
+              <w:bottom w:type="dxa" w:w="70"/>
+              <w:right w:type="dxa" w:w="100"/>
+            </w:tcMar>
+          </w:tcPr>
+          <w:p>
+            <w:pPr>
+              <w:spacing w:after="0"/>
+            </w:pPr>
+            <w:r>
+              <w:rPr>
+                <w:rFonts w:ascii="Arial" w:cs="Arial" w:eastAsia="Arial" w:hAnsi="Arial"/>
+              </w:rPr>
+              <w:t xml:space="preserve"> </w:t>
+            </w:r>
+          </w:p>
+        </w:tc>
+      </w:tr>
+    </w:tbl>
+    <w:p>
+      <w:pPr>
+        <w:keepNext/>
+        <w:spacing w:after="80" w:before="200"/>
+      </w:pPr>
+      <w:r>
+        <w:rPr>
+          <w:rFonts w:ascii="Arial" w:cs="Arial" w:eastAsia="Arial" w:hAnsi="Arial"/>
+          <w:b/>
+          <w:bCs/>
+        </w:rPr>
+        <w:t xml:space="preserve">4d.</w:t>
+      </w:r>
+      <w:r>
+        <w:rPr>
+          <w:rFonts w:ascii="Arial" w:cs="Arial" w:eastAsia="Arial" w:hAnsi="Arial"/>
+        </w:rPr>
+        <w:t xml:space="preserve"> </w:t>
+      </w:r>
+      <w:r>
+        <w:rPr>
+          <w:rFonts w:ascii="Arial" w:cs="Arial" w:eastAsia="Arial" w:hAnsi="Arial"/>
+          <w:b/>
+          <w:bCs/>
+        </w:rPr>
+        <w:t xml:space="preserve">Nucleus drawing.</w:t>
+      </w:r>
+      <w:r>
+        <w:rPr>
+          <w:rFonts w:ascii="Arial" w:cs="Arial" w:eastAsia="Arial" w:hAnsi="Arial"/>
+        </w:rPr>
+        <w:t xml:space="preserve"> A textbook draws a nucleus at a scale of </w:t>
+      </w:r>
+      <w:r>
+        <w:rPr>
+          <w:rFonts w:ascii="Arial" w:cs="Arial" w:eastAsia="Arial" w:hAnsi="Arial"/>
+          <w:b/>
+          <w:bCs/>
+        </w:rPr>
+        <w:t xml:space="preserve">500×</w:t>
+      </w:r>
+      <w:r>
+        <w:rPr>
+          <w:rFonts w:ascii="Arial" w:cs="Arial" w:eastAsia="Arial" w:hAnsi="Arial"/>
+        </w:rPr>
+        <w:t xml:space="preserve">. A real nucleus is about </w:t>
+      </w:r>
+      <w:r>
+        <w:rPr>
+          <w:rFonts w:ascii="Arial" w:cs="Arial" w:eastAsia="Arial" w:hAnsi="Arial"/>
+          <w:b/>
+          <w:bCs/>
+        </w:rPr>
+        <w:t xml:space="preserve">10 µm</w:t>
+      </w:r>
+      <w:r>
+        <w:rPr>
+          <w:rFonts w:ascii="Arial" w:cs="Arial" w:eastAsia="Arial" w:hAnsi="Arial"/>
+        </w:rPr>
+        <w:t xml:space="preserve"> across. How big is the nucleus in the drawing (in µm, then mm)?</w:t>
+      </w:r>
+    </w:p>
+    <w:tbl>
+      <w:tblPr>
+        <w:tblW w:type="dxa" w:w="10080"/>
+        <w:tblBorders>
+          <w:top w:val="single" w:color="auto" w:sz="4"/>
+          <w:left w:val="single" w:color="auto" w:sz="4"/>
+          <w:bottom w:val="single" w:color="auto" w:sz="4"/>
+          <w:right w:val="single" w:color="auto" w:sz="4"/>
+          <w:insideH w:val="single" w:color="auto" w:sz="4"/>
+          <w:insideV w:val="single" w:color="auto" w:sz="4"/>
+        </w:tblBorders>
+        <w:tblLayout w:type="fixed"/>
+      </w:tblPr>
+      <w:tblGrid>
+        <w:gridCol w:w="10080"/>
+      </w:tblGrid>
+      <w:tr>
+        <w:trPr>
+          <w:cantSplit w:val="false"/>
+          <w:trHeight w:val="1300" w:hRule="atLeast"/>
+        </w:trPr>
+        <w:tc>
+          <w:tcPr>
+            <w:tcW w:type="dxa" w:w="10080"/>
+            <w:tcBorders>
+              <w:top w:val="single" w:color="9A9A9A" w:sz="4"/>
+              <w:left w:val="single" w:color="9A9A9A" w:sz="4"/>
+              <w:bottom w:val="single" w:color="9A9A9A" w:sz="4"/>
+              <w:right w:val="single" w:color="9A9A9A" w:sz="4"/>
+            </w:tcBorders>
+            <w:tcMar>
+              <w:top w:type="dxa" w:w="70"/>
+              <w:left w:type="dxa" w:w="100"/>
+              <w:bottom w:type="dxa" w:w="70"/>
+              <w:right w:type="dxa" w:w="100"/>
+            </w:tcMar>
+          </w:tcPr>
+          <w:p>
+            <w:pPr>
+              <w:spacing w:after="0"/>
+            </w:pPr>
+            <w:r>
+              <w:rPr>
+                <w:rFonts w:ascii="Arial" w:cs="Arial" w:eastAsia="Arial" w:hAnsi="Arial"/>
+              </w:rPr>
+              <w:t xml:space="preserve"> </w:t>
+            </w:r>
+          </w:p>
+        </w:tc>
+      </w:tr>
+    </w:tbl>
+    <w:p>
+      <w:pPr>
+        <w:keepNext/>
+        <w:spacing w:after="80" w:before="200"/>
+      </w:pPr>
+      <w:r>
+        <w:rPr>
+          <w:rFonts w:ascii="Arial" w:cs="Arial" w:eastAsia="Arial" w:hAnsi="Arial"/>
+          <w:b/>
+          <w:bCs/>
+        </w:rPr>
+        <w:t xml:space="preserve">4e.</w:t>
+      </w:r>
+      <w:r>
+        <w:rPr>
+          <w:rFonts w:ascii="Arial" w:cs="Arial" w:eastAsia="Arial" w:hAnsi="Arial"/>
+        </w:rPr>
+        <w:t xml:space="preserve"> </w:t>
+      </w:r>
+      <w:r>
+        <w:rPr>
+          <w:rFonts w:ascii="Arial" w:cs="Arial" w:eastAsia="Arial" w:hAnsi="Arial"/>
+          <w:b/>
+          <w:bCs/>
+        </w:rPr>
+        <w:t xml:space="preserve">Mitochondrion.</w:t>
+      </w:r>
+      <w:r>
+        <w:rPr>
+          <w:rFonts w:ascii="Arial" w:cs="Arial" w:eastAsia="Arial" w:hAnsi="Arial"/>
+        </w:rPr>
+        <w:t xml:space="preserve"> In a diagram, a mitochondrion is drawn </w:t>
+      </w:r>
+      <w:r>
+        <w:rPr>
+          <w:rFonts w:ascii="Arial" w:cs="Arial" w:eastAsia="Arial" w:hAnsi="Arial"/>
+          <w:b/>
+          <w:bCs/>
+        </w:rPr>
+        <w:t xml:space="preserve">2 mm</w:t>
+      </w:r>
+      <w:r>
+        <w:rPr>
+          <w:rFonts w:ascii="Arial" w:cs="Arial" w:eastAsia="Arial" w:hAnsi="Arial"/>
+        </w:rPr>
+        <w:t xml:space="preserve"> long. The scale of the diagram is </w:t>
+      </w:r>
+      <w:r>
+        <w:rPr>
+          <w:rFonts w:ascii="Arial" w:cs="Arial" w:eastAsia="Arial" w:hAnsi="Arial"/>
+          <w:b/>
+          <w:bCs/>
+        </w:rPr>
+        <w:t xml:space="preserve">2,000×</w:t>
+      </w:r>
+      <w:r>
+        <w:rPr>
+          <w:rFonts w:ascii="Arial" w:cs="Arial" w:eastAsia="Arial" w:hAnsi="Arial"/>
+        </w:rPr>
+        <w:t xml:space="preserve">. What is the real length of the mitochondrion in µm?</w:t>
+      </w:r>
+    </w:p>
+    <w:tbl>
+      <w:tblPr>
+        <w:tblW w:type="dxa" w:w="10080"/>
+        <w:tblBorders>
+          <w:top w:val="single" w:color="auto" w:sz="4"/>
+          <w:left w:val="single" w:color="auto" w:sz="4"/>
+          <w:bottom w:val="single" w:color="auto" w:sz="4"/>
+          <w:right w:val="single" w:color="auto" w:sz="4"/>
+          <w:insideH w:val="single" w:color="auto" w:sz="4"/>
+          <w:insideV w:val="single" w:color="auto" w:sz="4"/>
+        </w:tblBorders>
+        <w:tblLayout w:type="fixed"/>
+      </w:tblPr>
+      <w:tblGrid>
+        <w:gridCol w:w="10080"/>
+      </w:tblGrid>
+      <w:tr>
+        <w:trPr>
+          <w:cantSplit w:val="false"/>
+          <w:trHeight w:val="1300" w:hRule="atLeast"/>
+        </w:trPr>
+        <w:tc>
+          <w:tcPr>
+            <w:tcW w:type="dxa" w:w="10080"/>
+            <w:tcBorders>
+              <w:top w:val="single" w:color="9A9A9A" w:sz="4"/>
+              <w:left w:val="single" w:color="9A9A9A" w:sz="4"/>
+              <w:bottom w:val="single" w:color="9A9A9A" w:sz="4"/>
+              <w:right w:val="single" w:color="9A9A9A" w:sz="4"/>
+            </w:tcBorders>
+            <w:tcMar>
+              <w:top w:type="dxa" w:w="70"/>
+              <w:left w:type="dxa" w:w="100"/>
+              <w:bottom w:type="dxa" w:w="70"/>
+              <w:right w:type="dxa" w:w="100"/>
+            </w:tcMar>
+          </w:tcPr>
+          <w:p>
+            <w:pPr>
+              <w:spacing w:after="0"/>
+            </w:pPr>
+            <w:r>
+              <w:rPr>
+                <w:rFonts w:ascii="Arial" w:cs="Arial" w:eastAsia="Arial" w:hAnsi="Arial"/>
+              </w:rPr>
+              <w:t xml:space="preserve"> </w:t>
+            </w:r>
+          </w:p>
+        </w:tc>
+      </w:tr>
+    </w:tbl>
+    <w:p>
+      <w:pPr>
+        <w:keepNext/>
+        <w:spacing w:after="80" w:before="200"/>
+      </w:pPr>
+      <w:r>
+        <w:rPr>
+          <w:rFonts w:ascii="Arial" w:cs="Arial" w:eastAsia="Arial" w:hAnsi="Arial"/>
+          <w:b/>
+          <w:bCs/>
+        </w:rPr>
+        <w:t xml:space="preserve">4f.</w:t>
+      </w:r>
+      <w:r>
+        <w:rPr>
+          <w:rFonts w:ascii="Arial" w:cs="Arial" w:eastAsia="Arial" w:hAnsi="Arial"/>
+        </w:rPr>
+        <w:t xml:space="preserve"> </w:t>
+      </w:r>
+      <w:r>
+        <w:rPr>
+          <w:rFonts w:ascii="Arial" w:cs="Arial" w:eastAsia="Arial" w:hAnsi="Arial"/>
+          <w:b/>
+          <w:bCs/>
+        </w:rPr>
+        <w:t xml:space="preserve">Whole cell.</w:t>
+      </w:r>
+      <w:r>
+        <w:rPr>
+          <w:rFonts w:ascii="Arial" w:cs="Arial" w:eastAsia="Arial" w:hAnsi="Arial"/>
+        </w:rPr>
+        <w:t xml:space="preserve"> A drawing shows a plant cell </w:t>
+      </w:r>
+      <w:r>
+        <w:rPr>
+          <w:rFonts w:ascii="Arial" w:cs="Arial" w:eastAsia="Arial" w:hAnsi="Arial"/>
+          <w:b/>
+          <w:bCs/>
+        </w:rPr>
+        <w:t xml:space="preserve">12 cm</w:t>
+      </w:r>
+      <w:r>
+        <w:rPr>
+          <w:rFonts w:ascii="Arial" w:cs="Arial" w:eastAsia="Arial" w:hAnsi="Arial"/>
+        </w:rPr>
+        <w:t xml:space="preserve"> wide. The real cell is </w:t>
+      </w:r>
+      <w:r>
+        <w:rPr>
+          <w:rFonts w:ascii="Arial" w:cs="Arial" w:eastAsia="Arial" w:hAnsi="Arial"/>
+          <w:b/>
+          <w:bCs/>
+        </w:rPr>
+        <w:t xml:space="preserve">60 µm</w:t>
+      </w:r>
+      <w:r>
+        <w:rPr>
+          <w:rFonts w:ascii="Arial" w:cs="Arial" w:eastAsia="Arial" w:hAnsi="Arial"/>
+        </w:rPr>
+        <w:t xml:space="preserve"> wide. (i) Change 12 cm to µm. (ii) What is the scale of the drawing?</w:t>
+      </w:r>
+    </w:p>
+    <w:tbl>
+      <w:tblPr>
+        <w:tblW w:type="dxa" w:w="10080"/>
+        <w:tblBorders>
+          <w:top w:val="single" w:color="auto" w:sz="4"/>
+          <w:left w:val="single" w:color="auto" w:sz="4"/>
+          <w:bottom w:val="single" w:color="auto" w:sz="4"/>
+          <w:right w:val="single" w:color="auto" w:sz="4"/>
+          <w:insideH w:val="single" w:color="auto" w:sz="4"/>
+          <w:insideV w:val="single" w:color="auto" w:sz="4"/>
+        </w:tblBorders>
+        <w:tblLayout w:type="fixed"/>
+      </w:tblPr>
+      <w:tblGrid>
+        <w:gridCol w:w="10080"/>
+      </w:tblGrid>
+      <w:tr>
+        <w:trPr>
+          <w:cantSplit w:val="false"/>
+          <w:trHeight w:val="1500" w:hRule="atLeast"/>
+        </w:trPr>
+        <w:tc>
+          <w:tcPr>
+            <w:tcW w:type="dxa" w:w="10080"/>
+            <w:tcBorders>
+              <w:top w:val="single" w:color="9A9A9A" w:sz="4"/>
+              <w:left w:val="single" w:color="9A9A9A" w:sz="4"/>
+              <w:bottom w:val="single" w:color="9A9A9A" w:sz="4"/>
+              <w:right w:val="single" w:color="9A9A9A" w:sz="4"/>
+            </w:tcBorders>
+            <w:tcMar>
+              <w:top w:type="dxa" w:w="70"/>
+              <w:left w:type="dxa" w:w="100"/>
+              <w:bottom w:type="dxa" w:w="70"/>
+              <w:right w:type="dxa" w:w="100"/>
+            </w:tcMar>
+          </w:tcPr>
+          <w:p>
+            <w:pPr>
+              <w:spacing w:after="0"/>
+            </w:pPr>
+            <w:r>
+              <w:rPr>
+                <w:rFonts w:ascii="Arial" w:cs="Arial" w:eastAsia="Arial" w:hAnsi="Arial"/>
+              </w:rPr>
+              <w:t xml:space="preserve"> </w:t>
+            </w:r>
+          </w:p>
+        </w:tc>
+      </w:tr>
+    </w:tbl>
+    <w:p>
+      <w:pPr>
+        <w:keepNext/>
+        <w:spacing w:after="80" w:before="200"/>
+      </w:pPr>
+      <w:r>
+        <w:rPr>
+          <w:rFonts w:ascii="Arial" w:cs="Arial" w:eastAsia="Arial" w:hAnsi="Arial"/>
+          <w:b/>
+          <w:bCs/>
+        </w:rPr>
+        <w:t xml:space="preserve">4g.</w:t>
+      </w:r>
+      <w:r>
+        <w:rPr>
+          <w:rFonts w:ascii="Arial" w:cs="Arial" w:eastAsia="Arial" w:hAnsi="Arial"/>
+        </w:rPr>
+        <w:t xml:space="preserve"> </w:t>
+      </w:r>
+      <w:r>
+        <w:rPr>
+          <w:rFonts w:ascii="Arial" w:cs="Arial" w:eastAsia="Arial" w:hAnsi="Arial"/>
+          <w:b/>
+          <w:bCs/>
+        </w:rPr>
+        <w:t xml:space="preserve">How many fit?</w:t>
+      </w:r>
+      <w:r>
+        <w:rPr>
+          <w:rFonts w:ascii="Arial" w:cs="Arial" w:eastAsia="Arial" w:hAnsi="Arial"/>
+        </w:rPr>
+        <w:t xml:space="preserve"> A plant cell is </w:t>
+      </w:r>
+      <w:r>
+        <w:rPr>
+          <w:rFonts w:ascii="Arial" w:cs="Arial" w:eastAsia="Arial" w:hAnsi="Arial"/>
+          <w:b/>
+          <w:bCs/>
+        </w:rPr>
+        <w:t xml:space="preserve">100 µm</w:t>
+      </w:r>
+      <w:r>
+        <w:rPr>
+          <w:rFonts w:ascii="Arial" w:cs="Arial" w:eastAsia="Arial" w:hAnsi="Arial"/>
+        </w:rPr>
+        <w:t xml:space="preserve"> wide. About how many </w:t>
+      </w:r>
+      <w:r>
+        <w:rPr>
+          <w:rFonts w:ascii="Arial" w:cs="Arial" w:eastAsia="Arial" w:hAnsi="Arial"/>
+          <w:b/>
+          <w:bCs/>
+        </w:rPr>
+        <w:t xml:space="preserve">2 µm</w:t>
+      </w:r>
+      <w:r>
+        <w:rPr>
+          <w:rFonts w:ascii="Arial" w:cs="Arial" w:eastAsia="Arial" w:hAnsi="Arial"/>
+        </w:rPr>
+        <w:t xml:space="preserve"> mitochondria could line up across it? About how many </w:t>
+      </w:r>
+      <w:r>
+        <w:rPr>
+          <w:rFonts w:ascii="Arial" w:cs="Arial" w:eastAsia="Arial" w:hAnsi="Arial"/>
+          <w:b/>
+          <w:bCs/>
+        </w:rPr>
+        <w:t xml:space="preserve">20 µm</w:t>
+      </w:r>
+      <w:r>
+        <w:rPr>
+          <w:rFonts w:ascii="Arial" w:cs="Arial" w:eastAsia="Arial" w:hAnsi="Arial"/>
+        </w:rPr>
+        <w:t xml:space="preserve"> animal cells could line up across a </w:t>
+      </w:r>
+      <w:r>
+        <w:rPr>
+          <w:rFonts w:ascii="Arial" w:cs="Arial" w:eastAsia="Arial" w:hAnsi="Arial"/>
+          <w:b/>
+          <w:bCs/>
+        </w:rPr>
+        <w:t xml:space="preserve">1 mm</w:t>
+      </w:r>
+      <w:r>
+        <w:rPr>
+          <w:rFonts w:ascii="Arial" w:cs="Arial" w:eastAsia="Arial" w:hAnsi="Arial"/>
+        </w:rPr>
+        <w:t xml:space="preserve"> (1,000 µm) line?</w:t>
+      </w:r>
+    </w:p>
+    <w:tbl>
+      <w:tblPr>
+        <w:tblW w:type="dxa" w:w="10080"/>
+        <w:tblBorders>
+          <w:top w:val="single" w:color="auto" w:sz="4"/>
+          <w:left w:val="single" w:color="auto" w:sz="4"/>
+          <w:bottom w:val="single" w:color="auto" w:sz="4"/>
+          <w:right w:val="single" w:color="auto" w:sz="4"/>
+          <w:insideH w:val="single" w:color="auto" w:sz="4"/>
+          <w:insideV w:val="single" w:color="auto" w:sz="4"/>
+        </w:tblBorders>
+        <w:tblLayout w:type="fixed"/>
+      </w:tblPr>
+      <w:tblGrid>
+        <w:gridCol w:w="10080"/>
+      </w:tblGrid>
+      <w:tr>
+        <w:trPr>
+          <w:cantSplit w:val="false"/>
+          <w:trHeight w:val="1500" w:hRule="atLeast"/>
+        </w:trPr>
+        <w:tc>
+          <w:tcPr>
+            <w:tcW w:type="dxa" w:w="10080"/>
+            <w:tcBorders>
+              <w:top w:val="single" w:color="9A9A9A" w:sz="4"/>
+              <w:left w:val="single" w:color="9A9A9A" w:sz="4"/>
+              <w:bottom w:val="single" w:color="9A9A9A" w:sz="4"/>
+              <w:right w:val="single" w:color="9A9A9A" w:sz="4"/>
+            </w:tcBorders>
+            <w:tcMar>
+              <w:top w:type="dxa" w:w="70"/>
+              <w:left w:type="dxa" w:w="100"/>
+              <w:bottom w:type="dxa" w:w="70"/>
+              <w:right w:type="dxa" w:w="100"/>
+            </w:tcMar>
+          </w:tcPr>
+          <w:p>
+            <w:pPr>
+              <w:spacing w:after="0"/>
+            </w:pPr>
+            <w:r>
+              <w:rPr>
+                <w:rFonts w:ascii="Arial" w:cs="Arial" w:eastAsia="Arial" w:hAnsi="Arial"/>
+              </w:rPr>
+              <w:t xml:space="preserve"> </w:t>
+            </w:r>
+          </w:p>
+        </w:tc>
+      </w:tr>
+    </w:tbl>
+    <w:p>
+      <w:pPr>
+        <w:keepNext/>
+        <w:spacing w:after="80" w:before="200"/>
+      </w:pPr>
+      <w:r>
+        <w:rPr>
+          <w:rFonts w:ascii="Arial" w:cs="Arial" w:eastAsia="Arial" w:hAnsi="Arial"/>
+          <w:b/>
+          <w:bCs/>
+        </w:rPr>
+        <w:t xml:space="preserve">4h.</w:t>
+      </w:r>
+      <w:r>
+        <w:rPr>
+          <w:rFonts w:ascii="Arial" w:cs="Arial" w:eastAsia="Arial" w:hAnsi="Arial"/>
+        </w:rPr>
+        <w:t xml:space="preserve"> </w:t>
+      </w:r>
+      <w:r>
+        <w:rPr>
+          <w:rFonts w:ascii="Arial" w:cs="Arial" w:eastAsia="Arial" w:hAnsi="Arial"/>
+          <w:b/>
+          <w:bCs/>
+        </w:rPr>
+        <w:t xml:space="preserve">Surface area (challenge).</w:t>
+      </w:r>
+      <w:r>
+        <w:rPr>
+          <w:rFonts w:ascii="Arial" w:cs="Arial" w:eastAsia="Arial" w:hAnsi="Arial"/>
+        </w:rPr>
+        <w:t xml:space="preserve"> For a cube, surface area = 6 × side × side and volume = side × side × side. Find the surface area and volume of a cube with a </w:t>
+      </w:r>
+      <w:r>
+        <w:rPr>
+          <w:rFonts w:ascii="Arial" w:cs="Arial" w:eastAsia="Arial" w:hAnsi="Arial"/>
+          <w:b/>
+          <w:bCs/>
+        </w:rPr>
+        <w:t xml:space="preserve">2 cm</w:t>
+      </w:r>
+      <w:r>
+        <w:rPr>
+          <w:rFonts w:ascii="Arial" w:cs="Arial" w:eastAsia="Arial" w:hAnsi="Arial"/>
+        </w:rPr>
+        <w:t xml:space="preserve"> side and a cube with a </w:t>
+      </w:r>
+      <w:r>
+        <w:rPr>
+          <w:rFonts w:ascii="Arial" w:cs="Arial" w:eastAsia="Arial" w:hAnsi="Arial"/>
+          <w:b/>
+          <w:bCs/>
+        </w:rPr>
+        <w:t xml:space="preserve">4 cm</w:t>
+      </w:r>
+      <w:r>
+        <w:rPr>
+          <w:rFonts w:ascii="Arial" w:cs="Arial" w:eastAsia="Arial" w:hAnsi="Arial"/>
+        </w:rPr>
+        <w:t xml:space="preserve"> side. Which one has more surface area </w:t>
+      </w:r>
+      <w:r>
+        <w:rPr>
+          <w:rFonts w:ascii="Arial" w:cs="Arial" w:eastAsia="Arial" w:hAnsi="Arial"/>
+          <w:b/>
+          <w:bCs/>
+        </w:rPr>
+        <w:t xml:space="preserve">for each unit of volume</w:t>
+      </w:r>
+      <w:r>
+        <w:rPr>
+          <w:rFonts w:ascii="Arial" w:cs="Arial" w:eastAsia="Arial" w:hAnsi="Arial"/>
+        </w:rPr>
+        <w:t xml:space="preserve">? (This idea will help explain why cells are small.)</w:t>
+      </w:r>
+    </w:p>
+    <w:tbl>
+      <w:tblPr>
+        <w:tblW w:type="dxa" w:w="10080"/>
+        <w:tblBorders>
+          <w:top w:val="single" w:color="auto" w:sz="4"/>
+          <w:left w:val="single" w:color="auto" w:sz="4"/>
+          <w:bottom w:val="single" w:color="auto" w:sz="4"/>
+          <w:right w:val="single" w:color="auto" w:sz="4"/>
+          <w:insideH w:val="single" w:color="auto" w:sz="4"/>
+          <w:insideV w:val="single" w:color="auto" w:sz="4"/>
+        </w:tblBorders>
+        <w:tblLayout w:type="fixed"/>
+      </w:tblPr>
+      <w:tblGrid>
+        <w:gridCol w:w="10080"/>
+      </w:tblGrid>
+      <w:tr>
+        <w:trPr>
+          <w:cantSplit w:val="false"/>
+          <w:trHeight w:val="2200" w:hRule="atLeast"/>
         </w:trPr>
         <w:tc>
           <w:tcPr>
@@ -5716,6 +8683,105 @@
         <w:trPr>
           <w:cantSplit w:val="false"/>
           <w:trHeight w:val="1400" w:hRule="atLeast"/>
+        </w:trPr>
+        <w:tc>
+          <w:tcPr>
+            <w:tcW w:type="dxa" w:w="10080"/>
+            <w:tcBorders>
+              <w:top w:val="single" w:color="9A9A9A" w:sz="4"/>
+              <w:left w:val="single" w:color="9A9A9A" w:sz="4"/>
+              <w:bottom w:val="single" w:color="9A9A9A" w:sz="4"/>
+              <w:right w:val="single" w:color="9A9A9A" w:sz="4"/>
+            </w:tcBorders>
+            <w:tcMar>
+              <w:top w:type="dxa" w:w="70"/>
+              <w:left w:type="dxa" w:w="100"/>
+              <w:bottom w:type="dxa" w:w="70"/>
+              <w:right w:type="dxa" w:w="100"/>
+            </w:tcMar>
+          </w:tcPr>
+          <w:p>
+            <w:pPr>
+              <w:spacing w:after="0"/>
+            </w:pPr>
+            <w:r>
+              <w:rPr>
+                <w:rFonts w:ascii="Arial" w:cs="Arial" w:eastAsia="Arial" w:hAnsi="Arial"/>
+              </w:rPr>
+              <w:t xml:space="preserve"> </w:t>
+            </w:r>
+          </w:p>
+        </w:tc>
+      </w:tr>
+    </w:tbl>
+    <w:p>
+      <w:pPr>
+        <w:keepNext/>
+        <w:spacing w:after="80" w:before="200"/>
+      </w:pPr>
+      <w:r>
+        <w:rPr>
+          <w:rFonts w:ascii="Arial" w:cs="Arial" w:eastAsia="Arial" w:hAnsi="Arial"/>
+          <w:b/>
+          <w:bCs/>
+        </w:rPr>
+        <w:t xml:space="preserve">5c.</w:t>
+      </w:r>
+      <w:r>
+        <w:rPr>
+          <w:rFonts w:ascii="Arial" w:cs="Arial" w:eastAsia="Arial" w:hAnsi="Arial"/>
+        </w:rPr>
+        <w:t xml:space="preserve"> </w:t>
+      </w:r>
+      <w:r>
+        <w:rPr>
+          <w:rFonts w:ascii="Arial" w:cs="Arial" w:eastAsia="Arial" w:hAnsi="Arial"/>
+          <w:b/>
+          <w:bCs/>
+        </w:rPr>
+        <w:t xml:space="preserve">Connect to cells.</w:t>
+      </w:r>
+      <w:r>
+        <w:rPr>
+          <w:rFonts w:ascii="Arial" w:cs="Arial" w:eastAsia="Arial" w:hAnsi="Arial"/>
+        </w:rPr>
+        <w:t xml:space="preserve"> Compare the size estimates in your table with the organelle sizes on your fact sheet. For each of your three objects, name the organelle or cell that is </w:t>
+      </w:r>
+      <w:r>
+        <w:rPr>
+          <w:rFonts w:ascii="Arial" w:cs="Arial" w:eastAsia="Arial" w:hAnsi="Arial"/>
+          <w:b/>
+          <w:bCs/>
+        </w:rPr>
+        <w:t xml:space="preserve">closest in size</w:t>
+      </w:r>
+      <w:r>
+        <w:rPr>
+          <w:rFonts w:ascii="Arial" w:cs="Arial" w:eastAsia="Arial" w:hAnsi="Arial"/>
+        </w:rPr>
+        <w:t xml:space="preserve"> to the feature you plan to measure. Do you think your microscope could show that organelle? Explain your reasoning.</w:t>
+      </w:r>
+    </w:p>
+    <w:tbl>
+      <w:tblPr>
+        <w:tblW w:type="dxa" w:w="10080"/>
+        <w:tblBorders>
+          <w:top w:val="single" w:color="auto" w:sz="4"/>
+          <w:left w:val="single" w:color="auto" w:sz="4"/>
+          <w:bottom w:val="single" w:color="auto" w:sz="4"/>
+          <w:right w:val="single" w:color="auto" w:sz="4"/>
+          <w:insideH w:val="single" w:color="auto" w:sz="4"/>
+          <w:insideV w:val="single" w:color="auto" w:sz="4"/>
+        </w:tblBorders>
+        <w:tblLayout w:type="fixed"/>
+      </w:tblPr>
+      <w:tblGrid>
+        <w:gridCol w:w="10080"/>
+      </w:tblGrid>
+      <w:tr>
+        <w:trPr>
+          <w:cantSplit w:val="false"/>
+          <w:trHeight w:val="2200" w:hRule="atLeast"/>
         </w:trPr>
         <w:tc>
           <w:tcPr>

</xml_diff>